<commit_message>
Add pipeline diagram and survey comparison table
Figure 3.1 (fig-design-pipeline.png, drawn by
harness/make-pipeline-diagram.py) replaces the placeholder in
Chapter 3; Table 2.1 compares the 15 surveyed works on six
criteria with the three gap columns empty except for this
thesis. The DOCX was regenerated with both embedded (11 images,
10 tables); the only content marker left in the report is the
advisor-dependent TODO 4.7-(3).
</commit_message>
<xml_diff>
--- a/docs/bao-cao/bao-cao-doan.docx
+++ b/docs/bao-cao/bao-cao-doan.docx
@@ -1276,12 +1276,2935 @@
     </w:p>
     <w:p>
       <w:r>
-        <w:rPr>
-          <w:i/>
-          <w:color w:val="606060"/>
-          <w:sz w:val="22"/>
-        </w:rPr>
-        <w:t>⟪Chỗ chèn: BẢNG 2.1 — 15 công trình × {nền tảng; tín hiệu vào (text/vision); nhiệm vụ; có so sánh đối chứng locator-vs-VLM?; có đo chi phí bảo trì?; có xét bảo mật?}. Ba cột cuối gần như trống toàn bộ ở 15 hàng — trực quan hóa ba khoảng trống; hàng cuối "Đồ án này" đánh dấu đủ ba cột. Dựng bảng khi ghép vào template.⟫</w:t>
+        <w:t>Bảng 2.1 đối chiếu 15 công trình trên sáu tiêu chí; ba cột cuối tương ứng ba khoảng trống ở mục 1.2 — gần như trống toàn bộ ở 15 hàng khảo sát:</w:t>
+      </w:r>
+    </w:p>
+    <w:tbl>
+      <w:tblPr>
+        <w:tblStyle w:val="TableGrid"/>
+        <w:tblW w:type="auto" w:w="0"/>
+        <w:tblLook w:firstColumn="1" w:firstRow="1" w:lastColumn="0" w:lastRow="0" w:noHBand="0" w:noVBand="1" w:val="04A0"/>
+      </w:tblPr>
+      <w:tblGrid>
+        <w:gridCol w:w="1176"/>
+        <w:gridCol w:w="1176"/>
+        <w:gridCol w:w="1176"/>
+        <w:gridCol w:w="1176"/>
+        <w:gridCol w:w="1176"/>
+        <w:gridCol w:w="1176"/>
+        <w:gridCol w:w="1176"/>
+        <w:gridCol w:w="1176"/>
+      </w:tblGrid>
+      <w:tr>
+        <w:tc>
+          <w:tcPr>
+            <w:tcW w:type="dxa" w:w="1176"/>
+          </w:tcPr>
+          <w:p>
+            <w:pPr>
+              <w:spacing w:line="240" w:lineRule="auto" w:after="40"/>
+            </w:pPr>
+            <w:r>
+              <w:rPr>
+                <w:sz w:val="23"/>
+              </w:rPr>
+            </w:r>
+            <w:r>
+              <w:rPr>
+                <w:b/>
+                <w:sz w:val="23"/>
+              </w:rPr>
+              <w:t>#</w:t>
+            </w:r>
+          </w:p>
+        </w:tc>
+        <w:tc>
+          <w:tcPr>
+            <w:tcW w:type="dxa" w:w="1176"/>
+          </w:tcPr>
+          <w:p>
+            <w:pPr>
+              <w:spacing w:line="240" w:lineRule="auto" w:after="40"/>
+            </w:pPr>
+            <w:r>
+              <w:rPr>
+                <w:sz w:val="23"/>
+              </w:rPr>
+            </w:r>
+            <w:r>
+              <w:rPr>
+                <w:b/>
+                <w:sz w:val="23"/>
+              </w:rPr>
+              <w:t>Công trình</w:t>
+            </w:r>
+          </w:p>
+        </w:tc>
+        <w:tc>
+          <w:tcPr>
+            <w:tcW w:type="dxa" w:w="1176"/>
+          </w:tcPr>
+          <w:p>
+            <w:pPr>
+              <w:spacing w:line="240" w:lineRule="auto" w:after="40"/>
+            </w:pPr>
+            <w:r>
+              <w:rPr>
+                <w:sz w:val="23"/>
+              </w:rPr>
+            </w:r>
+            <w:r>
+              <w:rPr>
+                <w:b/>
+                <w:sz w:val="23"/>
+              </w:rPr>
+              <w:t>Nền tảng</w:t>
+            </w:r>
+          </w:p>
+        </w:tc>
+        <w:tc>
+          <w:tcPr>
+            <w:tcW w:type="dxa" w:w="1176"/>
+          </w:tcPr>
+          <w:p>
+            <w:pPr>
+              <w:spacing w:line="240" w:lineRule="auto" w:after="40"/>
+            </w:pPr>
+            <w:r>
+              <w:rPr>
+                <w:sz w:val="23"/>
+              </w:rPr>
+            </w:r>
+            <w:r>
+              <w:rPr>
+                <w:b/>
+                <w:sz w:val="23"/>
+              </w:rPr>
+              <w:t>Tín hiệu vào</w:t>
+            </w:r>
+          </w:p>
+        </w:tc>
+        <w:tc>
+          <w:tcPr>
+            <w:tcW w:type="dxa" w:w="1176"/>
+          </w:tcPr>
+          <w:p>
+            <w:pPr>
+              <w:spacing w:line="240" w:lineRule="auto" w:after="40"/>
+            </w:pPr>
+            <w:r>
+              <w:rPr>
+                <w:sz w:val="23"/>
+              </w:rPr>
+            </w:r>
+            <w:r>
+              <w:rPr>
+                <w:b/>
+                <w:sz w:val="23"/>
+              </w:rPr>
+              <w:t>Nhiệm vụ chính</w:t>
+            </w:r>
+          </w:p>
+        </w:tc>
+        <w:tc>
+          <w:tcPr>
+            <w:tcW w:type="dxa" w:w="1176"/>
+          </w:tcPr>
+          <w:p>
+            <w:pPr>
+              <w:spacing w:line="240" w:lineRule="auto" w:after="40"/>
+            </w:pPr>
+            <w:r>
+              <w:rPr>
+                <w:sz w:val="23"/>
+              </w:rPr>
+            </w:r>
+            <w:r>
+              <w:rPr>
+                <w:b/>
+                <w:sz w:val="23"/>
+              </w:rPr>
+              <w:t>So sánh cặp locator↔VLM</w:t>
+            </w:r>
+          </w:p>
+        </w:tc>
+        <w:tc>
+          <w:tcPr>
+            <w:tcW w:type="dxa" w:w="1176"/>
+          </w:tcPr>
+          <w:p>
+            <w:pPr>
+              <w:spacing w:line="240" w:lineRule="auto" w:after="40"/>
+            </w:pPr>
+            <w:r>
+              <w:rPr>
+                <w:sz w:val="23"/>
+              </w:rPr>
+            </w:r>
+            <w:r>
+              <w:rPr>
+                <w:b/>
+                <w:sz w:val="23"/>
+              </w:rPr>
+              <w:t>Đo chi phí bảo trì</w:t>
+            </w:r>
+          </w:p>
+        </w:tc>
+        <w:tc>
+          <w:tcPr>
+            <w:tcW w:type="dxa" w:w="1176"/>
+          </w:tcPr>
+          <w:p>
+            <w:pPr>
+              <w:spacing w:line="240" w:lineRule="auto" w:after="40"/>
+            </w:pPr>
+            <w:r>
+              <w:rPr>
+                <w:sz w:val="23"/>
+              </w:rPr>
+            </w:r>
+            <w:r>
+              <w:rPr>
+                <w:b/>
+                <w:sz w:val="23"/>
+              </w:rPr>
+              <w:t>Xét bảo mật</w:t>
+            </w:r>
+          </w:p>
+        </w:tc>
+      </w:tr>
+      <w:tr>
+        <w:tc>
+          <w:tcPr>
+            <w:tcW w:type="dxa" w:w="1176"/>
+          </w:tcPr>
+          <w:p>
+            <w:pPr>
+              <w:spacing w:line="240" w:lineRule="auto" w:after="40"/>
+            </w:pPr>
+            <w:r>
+              <w:rPr>
+                <w:sz w:val="23"/>
+              </w:rPr>
+            </w:r>
+            <w:r>
+              <w:rPr>
+                <w:sz w:val="23"/>
+              </w:rPr>
+              <w:t>[1]</w:t>
+            </w:r>
+          </w:p>
+        </w:tc>
+        <w:tc>
+          <w:tcPr>
+            <w:tcW w:type="dxa" w:w="1176"/>
+          </w:tcPr>
+          <w:p>
+            <w:pPr>
+              <w:spacing w:line="240" w:lineRule="auto" w:after="40"/>
+            </w:pPr>
+            <w:r>
+              <w:rPr>
+                <w:sz w:val="23"/>
+              </w:rPr>
+            </w:r>
+            <w:r>
+              <w:rPr>
+                <w:sz w:val="23"/>
+              </w:rPr>
+              <w:t>Survey LLM4Testing (TSE'24)</w:t>
+            </w:r>
+          </w:p>
+        </w:tc>
+        <w:tc>
+          <w:tcPr>
+            <w:tcW w:type="dxa" w:w="1176"/>
+          </w:tcPr>
+          <w:p>
+            <w:pPr>
+              <w:spacing w:line="240" w:lineRule="auto" w:after="40"/>
+            </w:pPr>
+            <w:r>
+              <w:rPr>
+                <w:sz w:val="23"/>
+              </w:rPr>
+            </w:r>
+            <w:r>
+              <w:rPr>
+                <w:sz w:val="23"/>
+              </w:rPr>
+              <w:t>tổng quát</w:t>
+            </w:r>
+          </w:p>
+        </w:tc>
+        <w:tc>
+          <w:tcPr>
+            <w:tcW w:type="dxa" w:w="1176"/>
+          </w:tcPr>
+          <w:p>
+            <w:pPr>
+              <w:spacing w:line="240" w:lineRule="auto" w:after="40"/>
+            </w:pPr>
+            <w:r>
+              <w:rPr>
+                <w:sz w:val="23"/>
+              </w:rPr>
+            </w:r>
+            <w:r>
+              <w:rPr>
+                <w:sz w:val="23"/>
+              </w:rPr>
+              <w:t>—</w:t>
+            </w:r>
+          </w:p>
+        </w:tc>
+        <w:tc>
+          <w:tcPr>
+            <w:tcW w:type="dxa" w:w="1176"/>
+          </w:tcPr>
+          <w:p>
+            <w:pPr>
+              <w:spacing w:line="240" w:lineRule="auto" w:after="40"/>
+            </w:pPr>
+            <w:r>
+              <w:rPr>
+                <w:sz w:val="23"/>
+              </w:rPr>
+            </w:r>
+            <w:r>
+              <w:rPr>
+                <w:sz w:val="23"/>
+              </w:rPr>
+              <w:t>khảo sát 102 công trình</w:t>
+            </w:r>
+          </w:p>
+        </w:tc>
+        <w:tc>
+          <w:tcPr>
+            <w:tcW w:type="dxa" w:w="1176"/>
+          </w:tcPr>
+          <w:p>
+            <w:pPr>
+              <w:spacing w:line="240" w:lineRule="auto" w:after="40"/>
+            </w:pPr>
+            <w:r>
+              <w:rPr>
+                <w:sz w:val="23"/>
+              </w:rPr>
+            </w:r>
+            <w:r>
+              <w:rPr>
+                <w:sz w:val="23"/>
+              </w:rPr>
+              <w:t>—</w:t>
+            </w:r>
+          </w:p>
+        </w:tc>
+        <w:tc>
+          <w:tcPr>
+            <w:tcW w:type="dxa" w:w="1176"/>
+          </w:tcPr>
+          <w:p>
+            <w:pPr>
+              <w:spacing w:line="240" w:lineRule="auto" w:after="40"/>
+            </w:pPr>
+            <w:r>
+              <w:rPr>
+                <w:sz w:val="23"/>
+              </w:rPr>
+            </w:r>
+            <w:r>
+              <w:rPr>
+                <w:sz w:val="23"/>
+              </w:rPr>
+              <w:t>—</w:t>
+            </w:r>
+          </w:p>
+        </w:tc>
+        <w:tc>
+          <w:tcPr>
+            <w:tcW w:type="dxa" w:w="1176"/>
+          </w:tcPr>
+          <w:p>
+            <w:pPr>
+              <w:spacing w:line="240" w:lineRule="auto" w:after="40"/>
+            </w:pPr>
+            <w:r>
+              <w:rPr>
+                <w:sz w:val="23"/>
+              </w:rPr>
+            </w:r>
+            <w:r>
+              <w:rPr>
+                <w:sz w:val="23"/>
+              </w:rPr>
+              <w:t>—</w:t>
+            </w:r>
+          </w:p>
+        </w:tc>
+      </w:tr>
+      <w:tr>
+        <w:tc>
+          <w:tcPr>
+            <w:tcW w:type="dxa" w:w="1176"/>
+          </w:tcPr>
+          <w:p>
+            <w:pPr>
+              <w:spacing w:line="240" w:lineRule="auto" w:after="40"/>
+            </w:pPr>
+            <w:r>
+              <w:rPr>
+                <w:sz w:val="23"/>
+              </w:rPr>
+            </w:r>
+            <w:r>
+              <w:rPr>
+                <w:sz w:val="23"/>
+              </w:rPr>
+              <w:t>[2]</w:t>
+            </w:r>
+          </w:p>
+        </w:tc>
+        <w:tc>
+          <w:tcPr>
+            <w:tcW w:type="dxa" w:w="1176"/>
+          </w:tcPr>
+          <w:p>
+            <w:pPr>
+              <w:spacing w:line="240" w:lineRule="auto" w:after="40"/>
+            </w:pPr>
+            <w:r>
+              <w:rPr>
+                <w:sz w:val="23"/>
+              </w:rPr>
+            </w:r>
+            <w:r>
+              <w:rPr>
+                <w:sz w:val="23"/>
+              </w:rPr>
+              <w:t>GPTDroid (ICSE'24)</w:t>
+            </w:r>
+          </w:p>
+        </w:tc>
+        <w:tc>
+          <w:tcPr>
+            <w:tcW w:type="dxa" w:w="1176"/>
+          </w:tcPr>
+          <w:p>
+            <w:pPr>
+              <w:spacing w:line="240" w:lineRule="auto" w:after="40"/>
+            </w:pPr>
+            <w:r>
+              <w:rPr>
+                <w:sz w:val="23"/>
+              </w:rPr>
+            </w:r>
+            <w:r>
+              <w:rPr>
+                <w:sz w:val="23"/>
+              </w:rPr>
+              <w:t>mobile</w:t>
+            </w:r>
+          </w:p>
+        </w:tc>
+        <w:tc>
+          <w:tcPr>
+            <w:tcW w:type="dxa" w:w="1176"/>
+          </w:tcPr>
+          <w:p>
+            <w:pPr>
+              <w:spacing w:line="240" w:lineRule="auto" w:after="40"/>
+            </w:pPr>
+            <w:r>
+              <w:rPr>
+                <w:sz w:val="23"/>
+              </w:rPr>
+            </w:r>
+            <w:r>
+              <w:rPr>
+                <w:sz w:val="23"/>
+              </w:rPr>
+              <w:t>text</w:t>
+            </w:r>
+          </w:p>
+        </w:tc>
+        <w:tc>
+          <w:tcPr>
+            <w:tcW w:type="dxa" w:w="1176"/>
+          </w:tcPr>
+          <w:p>
+            <w:pPr>
+              <w:spacing w:line="240" w:lineRule="auto" w:after="40"/>
+            </w:pPr>
+            <w:r>
+              <w:rPr>
+                <w:sz w:val="23"/>
+              </w:rPr>
+            </w:r>
+            <w:r>
+              <w:rPr>
+                <w:sz w:val="23"/>
+              </w:rPr>
+              <w:t>khám phá + phát hiện bug</w:t>
+            </w:r>
+          </w:p>
+        </w:tc>
+        <w:tc>
+          <w:tcPr>
+            <w:tcW w:type="dxa" w:w="1176"/>
+          </w:tcPr>
+          <w:p>
+            <w:pPr>
+              <w:spacing w:line="240" w:lineRule="auto" w:after="40"/>
+            </w:pPr>
+            <w:r>
+              <w:rPr>
+                <w:sz w:val="23"/>
+              </w:rPr>
+            </w:r>
+            <w:r>
+              <w:rPr>
+                <w:sz w:val="23"/>
+              </w:rPr>
+              <w:t>—</w:t>
+            </w:r>
+          </w:p>
+        </w:tc>
+        <w:tc>
+          <w:tcPr>
+            <w:tcW w:type="dxa" w:w="1176"/>
+          </w:tcPr>
+          <w:p>
+            <w:pPr>
+              <w:spacing w:line="240" w:lineRule="auto" w:after="40"/>
+            </w:pPr>
+            <w:r>
+              <w:rPr>
+                <w:sz w:val="23"/>
+              </w:rPr>
+            </w:r>
+            <w:r>
+              <w:rPr>
+                <w:sz w:val="23"/>
+              </w:rPr>
+              <w:t>—</w:t>
+            </w:r>
+          </w:p>
+        </w:tc>
+        <w:tc>
+          <w:tcPr>
+            <w:tcW w:type="dxa" w:w="1176"/>
+          </w:tcPr>
+          <w:p>
+            <w:pPr>
+              <w:spacing w:line="240" w:lineRule="auto" w:after="40"/>
+            </w:pPr>
+            <w:r>
+              <w:rPr>
+                <w:sz w:val="23"/>
+              </w:rPr>
+            </w:r>
+            <w:r>
+              <w:rPr>
+                <w:sz w:val="23"/>
+              </w:rPr>
+              <w:t>—</w:t>
+            </w:r>
+          </w:p>
+        </w:tc>
+      </w:tr>
+      <w:tr>
+        <w:tc>
+          <w:tcPr>
+            <w:tcW w:type="dxa" w:w="1176"/>
+          </w:tcPr>
+          <w:p>
+            <w:pPr>
+              <w:spacing w:line="240" w:lineRule="auto" w:after="40"/>
+            </w:pPr>
+            <w:r>
+              <w:rPr>
+                <w:sz w:val="23"/>
+              </w:rPr>
+            </w:r>
+            <w:r>
+              <w:rPr>
+                <w:sz w:val="23"/>
+              </w:rPr>
+              <w:t>[3]</w:t>
+            </w:r>
+          </w:p>
+        </w:tc>
+        <w:tc>
+          <w:tcPr>
+            <w:tcW w:type="dxa" w:w="1176"/>
+          </w:tcPr>
+          <w:p>
+            <w:pPr>
+              <w:spacing w:line="240" w:lineRule="auto" w:after="40"/>
+            </w:pPr>
+            <w:r>
+              <w:rPr>
+                <w:sz w:val="23"/>
+              </w:rPr>
+            </w:r>
+            <w:r>
+              <w:rPr>
+                <w:sz w:val="23"/>
+              </w:rPr>
+              <w:t>VETL (ICSME'24)</w:t>
+            </w:r>
+          </w:p>
+        </w:tc>
+        <w:tc>
+          <w:tcPr>
+            <w:tcW w:type="dxa" w:w="1176"/>
+          </w:tcPr>
+          <w:p>
+            <w:pPr>
+              <w:spacing w:line="240" w:lineRule="auto" w:after="40"/>
+            </w:pPr>
+            <w:r>
+              <w:rPr>
+                <w:sz w:val="23"/>
+              </w:rPr>
+            </w:r>
+            <w:r>
+              <w:rPr>
+                <w:sz w:val="23"/>
+              </w:rPr>
+              <w:t>web</w:t>
+            </w:r>
+          </w:p>
+        </w:tc>
+        <w:tc>
+          <w:tcPr>
+            <w:tcW w:type="dxa" w:w="1176"/>
+          </w:tcPr>
+          <w:p>
+            <w:pPr>
+              <w:spacing w:line="240" w:lineRule="auto" w:after="40"/>
+            </w:pPr>
+            <w:r>
+              <w:rPr>
+                <w:sz w:val="23"/>
+              </w:rPr>
+            </w:r>
+            <w:r>
+              <w:rPr>
+                <w:sz w:val="23"/>
+              </w:rPr>
+              <w:t>vision</w:t>
+            </w:r>
+          </w:p>
+        </w:tc>
+        <w:tc>
+          <w:tcPr>
+            <w:tcW w:type="dxa" w:w="1176"/>
+          </w:tcPr>
+          <w:p>
+            <w:pPr>
+              <w:spacing w:line="240" w:lineRule="auto" w:after="40"/>
+            </w:pPr>
+            <w:r>
+              <w:rPr>
+                <w:sz w:val="23"/>
+              </w:rPr>
+            </w:r>
+            <w:r>
+              <w:rPr>
+                <w:sz w:val="23"/>
+              </w:rPr>
+              <w:t>sinh input + chọn phần tử</w:t>
+            </w:r>
+          </w:p>
+        </w:tc>
+        <w:tc>
+          <w:tcPr>
+            <w:tcW w:type="dxa" w:w="1176"/>
+          </w:tcPr>
+          <w:p>
+            <w:pPr>
+              <w:spacing w:line="240" w:lineRule="auto" w:after="40"/>
+            </w:pPr>
+            <w:r>
+              <w:rPr>
+                <w:sz w:val="23"/>
+              </w:rPr>
+            </w:r>
+            <w:r>
+              <w:rPr>
+                <w:sz w:val="23"/>
+              </w:rPr>
+              <w:t>—</w:t>
+            </w:r>
+          </w:p>
+        </w:tc>
+        <w:tc>
+          <w:tcPr>
+            <w:tcW w:type="dxa" w:w="1176"/>
+          </w:tcPr>
+          <w:p>
+            <w:pPr>
+              <w:spacing w:line="240" w:lineRule="auto" w:after="40"/>
+            </w:pPr>
+            <w:r>
+              <w:rPr>
+                <w:sz w:val="23"/>
+              </w:rPr>
+            </w:r>
+            <w:r>
+              <w:rPr>
+                <w:sz w:val="23"/>
+              </w:rPr>
+              <w:t>—</w:t>
+            </w:r>
+          </w:p>
+        </w:tc>
+        <w:tc>
+          <w:tcPr>
+            <w:tcW w:type="dxa" w:w="1176"/>
+          </w:tcPr>
+          <w:p>
+            <w:pPr>
+              <w:spacing w:line="240" w:lineRule="auto" w:after="40"/>
+            </w:pPr>
+            <w:r>
+              <w:rPr>
+                <w:sz w:val="23"/>
+              </w:rPr>
+            </w:r>
+            <w:r>
+              <w:rPr>
+                <w:sz w:val="23"/>
+              </w:rPr>
+              <w:t>—</w:t>
+            </w:r>
+          </w:p>
+        </w:tc>
+      </w:tr>
+      <w:tr>
+        <w:tc>
+          <w:tcPr>
+            <w:tcW w:type="dxa" w:w="1176"/>
+          </w:tcPr>
+          <w:p>
+            <w:pPr>
+              <w:spacing w:line="240" w:lineRule="auto" w:after="40"/>
+            </w:pPr>
+            <w:r>
+              <w:rPr>
+                <w:sz w:val="23"/>
+              </w:rPr>
+            </w:r>
+            <w:r>
+              <w:rPr>
+                <w:sz w:val="23"/>
+              </w:rPr>
+              <w:t>[4]</w:t>
+            </w:r>
+          </w:p>
+        </w:tc>
+        <w:tc>
+          <w:tcPr>
+            <w:tcW w:type="dxa" w:w="1176"/>
+          </w:tcPr>
+          <w:p>
+            <w:pPr>
+              <w:spacing w:line="240" w:lineRule="auto" w:after="40"/>
+            </w:pPr>
+            <w:r>
+              <w:rPr>
+                <w:sz w:val="23"/>
+              </w:rPr>
+            </w:r>
+            <w:r>
+              <w:rPr>
+                <w:sz w:val="23"/>
+              </w:rPr>
+              <w:t>VisionDroid/Trident</w:t>
+            </w:r>
+          </w:p>
+        </w:tc>
+        <w:tc>
+          <w:tcPr>
+            <w:tcW w:type="dxa" w:w="1176"/>
+          </w:tcPr>
+          <w:p>
+            <w:pPr>
+              <w:spacing w:line="240" w:lineRule="auto" w:after="40"/>
+            </w:pPr>
+            <w:r>
+              <w:rPr>
+                <w:sz w:val="23"/>
+              </w:rPr>
+            </w:r>
+            <w:r>
+              <w:rPr>
+                <w:sz w:val="23"/>
+              </w:rPr>
+              <w:t>mobile</w:t>
+            </w:r>
+          </w:p>
+        </w:tc>
+        <w:tc>
+          <w:tcPr>
+            <w:tcW w:type="dxa" w:w="1176"/>
+          </w:tcPr>
+          <w:p>
+            <w:pPr>
+              <w:spacing w:line="240" w:lineRule="auto" w:after="40"/>
+            </w:pPr>
+            <w:r>
+              <w:rPr>
+                <w:sz w:val="23"/>
+              </w:rPr>
+            </w:r>
+            <w:r>
+              <w:rPr>
+                <w:sz w:val="23"/>
+              </w:rPr>
+              <w:t>vision</w:t>
+            </w:r>
+          </w:p>
+        </w:tc>
+        <w:tc>
+          <w:tcPr>
+            <w:tcW w:type="dxa" w:w="1176"/>
+          </w:tcPr>
+          <w:p>
+            <w:pPr>
+              <w:spacing w:line="240" w:lineRule="auto" w:after="40"/>
+            </w:pPr>
+            <w:r>
+              <w:rPr>
+                <w:sz w:val="23"/>
+              </w:rPr>
+            </w:r>
+            <w:r>
+              <w:rPr>
+                <w:sz w:val="23"/>
+              </w:rPr>
+              <w:t>oracle non-crash bug</w:t>
+            </w:r>
+          </w:p>
+        </w:tc>
+        <w:tc>
+          <w:tcPr>
+            <w:tcW w:type="dxa" w:w="1176"/>
+          </w:tcPr>
+          <w:p>
+            <w:pPr>
+              <w:spacing w:line="240" w:lineRule="auto" w:after="40"/>
+            </w:pPr>
+            <w:r>
+              <w:rPr>
+                <w:sz w:val="23"/>
+              </w:rPr>
+            </w:r>
+            <w:r>
+              <w:rPr>
+                <w:sz w:val="23"/>
+              </w:rPr>
+              <w:t>—</w:t>
+            </w:r>
+          </w:p>
+        </w:tc>
+        <w:tc>
+          <w:tcPr>
+            <w:tcW w:type="dxa" w:w="1176"/>
+          </w:tcPr>
+          <w:p>
+            <w:pPr>
+              <w:spacing w:line="240" w:lineRule="auto" w:after="40"/>
+            </w:pPr>
+            <w:r>
+              <w:rPr>
+                <w:sz w:val="23"/>
+              </w:rPr>
+            </w:r>
+            <w:r>
+              <w:rPr>
+                <w:sz w:val="23"/>
+              </w:rPr>
+              <w:t>—</w:t>
+            </w:r>
+          </w:p>
+        </w:tc>
+        <w:tc>
+          <w:tcPr>
+            <w:tcW w:type="dxa" w:w="1176"/>
+          </w:tcPr>
+          <w:p>
+            <w:pPr>
+              <w:spacing w:line="240" w:lineRule="auto" w:after="40"/>
+            </w:pPr>
+            <w:r>
+              <w:rPr>
+                <w:sz w:val="23"/>
+              </w:rPr>
+            </w:r>
+            <w:r>
+              <w:rPr>
+                <w:sz w:val="23"/>
+              </w:rPr>
+              <w:t>—</w:t>
+            </w:r>
+          </w:p>
+        </w:tc>
+      </w:tr>
+      <w:tr>
+        <w:tc>
+          <w:tcPr>
+            <w:tcW w:type="dxa" w:w="1176"/>
+          </w:tcPr>
+          <w:p>
+            <w:pPr>
+              <w:spacing w:line="240" w:lineRule="auto" w:after="40"/>
+            </w:pPr>
+            <w:r>
+              <w:rPr>
+                <w:sz w:val="23"/>
+              </w:rPr>
+            </w:r>
+            <w:r>
+              <w:rPr>
+                <w:sz w:val="23"/>
+              </w:rPr>
+              <w:t>[5]</w:t>
+            </w:r>
+          </w:p>
+        </w:tc>
+        <w:tc>
+          <w:tcPr>
+            <w:tcW w:type="dxa" w:w="1176"/>
+          </w:tcPr>
+          <w:p>
+            <w:pPr>
+              <w:spacing w:line="240" w:lineRule="auto" w:after="40"/>
+            </w:pPr>
+            <w:r>
+              <w:rPr>
+                <w:sz w:val="23"/>
+              </w:rPr>
+            </w:r>
+            <w:r>
+              <w:rPr>
+                <w:sz w:val="23"/>
+              </w:rPr>
+              <w:t>QTypist (ICSE'23)</w:t>
+            </w:r>
+          </w:p>
+        </w:tc>
+        <w:tc>
+          <w:tcPr>
+            <w:tcW w:type="dxa" w:w="1176"/>
+          </w:tcPr>
+          <w:p>
+            <w:pPr>
+              <w:spacing w:line="240" w:lineRule="auto" w:after="40"/>
+            </w:pPr>
+            <w:r>
+              <w:rPr>
+                <w:sz w:val="23"/>
+              </w:rPr>
+            </w:r>
+            <w:r>
+              <w:rPr>
+                <w:sz w:val="23"/>
+              </w:rPr>
+              <w:t>mobile</w:t>
+            </w:r>
+          </w:p>
+        </w:tc>
+        <w:tc>
+          <w:tcPr>
+            <w:tcW w:type="dxa" w:w="1176"/>
+          </w:tcPr>
+          <w:p>
+            <w:pPr>
+              <w:spacing w:line="240" w:lineRule="auto" w:after="40"/>
+            </w:pPr>
+            <w:r>
+              <w:rPr>
+                <w:sz w:val="23"/>
+              </w:rPr>
+            </w:r>
+            <w:r>
+              <w:rPr>
+                <w:sz w:val="23"/>
+              </w:rPr>
+              <w:t>text</w:t>
+            </w:r>
+          </w:p>
+        </w:tc>
+        <w:tc>
+          <w:tcPr>
+            <w:tcW w:type="dxa" w:w="1176"/>
+          </w:tcPr>
+          <w:p>
+            <w:pPr>
+              <w:spacing w:line="240" w:lineRule="auto" w:after="40"/>
+            </w:pPr>
+            <w:r>
+              <w:rPr>
+                <w:sz w:val="23"/>
+              </w:rPr>
+            </w:r>
+            <w:r>
+              <w:rPr>
+                <w:sz w:val="23"/>
+              </w:rPr>
+              <w:t>sinh text input</w:t>
+            </w:r>
+          </w:p>
+        </w:tc>
+        <w:tc>
+          <w:tcPr>
+            <w:tcW w:type="dxa" w:w="1176"/>
+          </w:tcPr>
+          <w:p>
+            <w:pPr>
+              <w:spacing w:line="240" w:lineRule="auto" w:after="40"/>
+            </w:pPr>
+            <w:r>
+              <w:rPr>
+                <w:sz w:val="23"/>
+              </w:rPr>
+            </w:r>
+            <w:r>
+              <w:rPr>
+                <w:sz w:val="23"/>
+              </w:rPr>
+              <w:t>—</w:t>
+            </w:r>
+          </w:p>
+        </w:tc>
+        <w:tc>
+          <w:tcPr>
+            <w:tcW w:type="dxa" w:w="1176"/>
+          </w:tcPr>
+          <w:p>
+            <w:pPr>
+              <w:spacing w:line="240" w:lineRule="auto" w:after="40"/>
+            </w:pPr>
+            <w:r>
+              <w:rPr>
+                <w:sz w:val="23"/>
+              </w:rPr>
+            </w:r>
+            <w:r>
+              <w:rPr>
+                <w:sz w:val="23"/>
+              </w:rPr>
+              <w:t>—</w:t>
+            </w:r>
+          </w:p>
+        </w:tc>
+        <w:tc>
+          <w:tcPr>
+            <w:tcW w:type="dxa" w:w="1176"/>
+          </w:tcPr>
+          <w:p>
+            <w:pPr>
+              <w:spacing w:line="240" w:lineRule="auto" w:after="40"/>
+            </w:pPr>
+            <w:r>
+              <w:rPr>
+                <w:sz w:val="23"/>
+              </w:rPr>
+            </w:r>
+            <w:r>
+              <w:rPr>
+                <w:sz w:val="23"/>
+              </w:rPr>
+              <w:t>—</w:t>
+            </w:r>
+          </w:p>
+        </w:tc>
+      </w:tr>
+      <w:tr>
+        <w:tc>
+          <w:tcPr>
+            <w:tcW w:type="dxa" w:w="1176"/>
+          </w:tcPr>
+          <w:p>
+            <w:pPr>
+              <w:spacing w:line="240" w:lineRule="auto" w:after="40"/>
+            </w:pPr>
+            <w:r>
+              <w:rPr>
+                <w:sz w:val="23"/>
+              </w:rPr>
+            </w:r>
+            <w:r>
+              <w:rPr>
+                <w:sz w:val="23"/>
+              </w:rPr>
+              <w:t>[6]</w:t>
+            </w:r>
+          </w:p>
+        </w:tc>
+        <w:tc>
+          <w:tcPr>
+            <w:tcW w:type="dxa" w:w="1176"/>
+          </w:tcPr>
+          <w:p>
+            <w:pPr>
+              <w:spacing w:line="240" w:lineRule="auto" w:after="40"/>
+            </w:pPr>
+            <w:r>
+              <w:rPr>
+                <w:sz w:val="23"/>
+              </w:rPr>
+            </w:r>
+            <w:r>
+              <w:rPr>
+                <w:sz w:val="23"/>
+              </w:rPr>
+              <w:t>LLMDroid (FSE'25)</w:t>
+            </w:r>
+          </w:p>
+        </w:tc>
+        <w:tc>
+          <w:tcPr>
+            <w:tcW w:type="dxa" w:w="1176"/>
+          </w:tcPr>
+          <w:p>
+            <w:pPr>
+              <w:spacing w:line="240" w:lineRule="auto" w:after="40"/>
+            </w:pPr>
+            <w:r>
+              <w:rPr>
+                <w:sz w:val="23"/>
+              </w:rPr>
+            </w:r>
+            <w:r>
+              <w:rPr>
+                <w:sz w:val="23"/>
+              </w:rPr>
+              <w:t>mobile</w:t>
+            </w:r>
+          </w:p>
+        </w:tc>
+        <w:tc>
+          <w:tcPr>
+            <w:tcW w:type="dxa" w:w="1176"/>
+          </w:tcPr>
+          <w:p>
+            <w:pPr>
+              <w:spacing w:line="240" w:lineRule="auto" w:after="40"/>
+            </w:pPr>
+            <w:r>
+              <w:rPr>
+                <w:sz w:val="23"/>
+              </w:rPr>
+            </w:r>
+            <w:r>
+              <w:rPr>
+                <w:sz w:val="23"/>
+              </w:rPr>
+              <w:t>text</w:t>
+            </w:r>
+          </w:p>
+        </w:tc>
+        <w:tc>
+          <w:tcPr>
+            <w:tcW w:type="dxa" w:w="1176"/>
+          </w:tcPr>
+          <w:p>
+            <w:pPr>
+              <w:spacing w:line="240" w:lineRule="auto" w:after="40"/>
+            </w:pPr>
+            <w:r>
+              <w:rPr>
+                <w:sz w:val="23"/>
+              </w:rPr>
+            </w:r>
+            <w:r>
+              <w:rPr>
+                <w:sz w:val="23"/>
+              </w:rPr>
+              <w:t>dẫn hướng coverage</w:t>
+            </w:r>
+          </w:p>
+        </w:tc>
+        <w:tc>
+          <w:tcPr>
+            <w:tcW w:type="dxa" w:w="1176"/>
+          </w:tcPr>
+          <w:p>
+            <w:pPr>
+              <w:spacing w:line="240" w:lineRule="auto" w:after="40"/>
+            </w:pPr>
+            <w:r>
+              <w:rPr>
+                <w:sz w:val="23"/>
+              </w:rPr>
+            </w:r>
+            <w:r>
+              <w:rPr>
+                <w:sz w:val="23"/>
+              </w:rPr>
+              <w:t>—</w:t>
+            </w:r>
+          </w:p>
+        </w:tc>
+        <w:tc>
+          <w:tcPr>
+            <w:tcW w:type="dxa" w:w="1176"/>
+          </w:tcPr>
+          <w:p>
+            <w:pPr>
+              <w:spacing w:line="240" w:lineRule="auto" w:after="40"/>
+            </w:pPr>
+            <w:r>
+              <w:rPr>
+                <w:sz w:val="23"/>
+              </w:rPr>
+            </w:r>
+            <w:r>
+              <w:rPr>
+                <w:sz w:val="23"/>
+              </w:rPr>
+              <w:t>△</w:t>
+            </w:r>
+          </w:p>
+        </w:tc>
+        <w:tc>
+          <w:tcPr>
+            <w:tcW w:type="dxa" w:w="1176"/>
+          </w:tcPr>
+          <w:p>
+            <w:pPr>
+              <w:spacing w:line="240" w:lineRule="auto" w:after="40"/>
+            </w:pPr>
+            <w:r>
+              <w:rPr>
+                <w:sz w:val="23"/>
+              </w:rPr>
+            </w:r>
+            <w:r>
+              <w:rPr>
+                <w:sz w:val="23"/>
+              </w:rPr>
+              <w:t>—</w:t>
+            </w:r>
+          </w:p>
+        </w:tc>
+      </w:tr>
+      <w:tr>
+        <w:tc>
+          <w:tcPr>
+            <w:tcW w:type="dxa" w:w="1176"/>
+          </w:tcPr>
+          <w:p>
+            <w:pPr>
+              <w:spacing w:line="240" w:lineRule="auto" w:after="40"/>
+            </w:pPr>
+            <w:r>
+              <w:rPr>
+                <w:sz w:val="23"/>
+              </w:rPr>
+            </w:r>
+            <w:r>
+              <w:rPr>
+                <w:sz w:val="23"/>
+              </w:rPr>
+              <w:t>[7]</w:t>
+            </w:r>
+          </w:p>
+        </w:tc>
+        <w:tc>
+          <w:tcPr>
+            <w:tcW w:type="dxa" w:w="1176"/>
+          </w:tcPr>
+          <w:p>
+            <w:pPr>
+              <w:spacing w:line="240" w:lineRule="auto" w:after="40"/>
+            </w:pPr>
+            <w:r>
+              <w:rPr>
+                <w:sz w:val="23"/>
+              </w:rPr>
+            </w:r>
+            <w:r>
+              <w:rPr>
+                <w:sz w:val="23"/>
+              </w:rPr>
+              <w:t>AUITestAgent</w:t>
+            </w:r>
+          </w:p>
+        </w:tc>
+        <w:tc>
+          <w:tcPr>
+            <w:tcW w:type="dxa" w:w="1176"/>
+          </w:tcPr>
+          <w:p>
+            <w:pPr>
+              <w:spacing w:line="240" w:lineRule="auto" w:after="40"/>
+            </w:pPr>
+            <w:r>
+              <w:rPr>
+                <w:sz w:val="23"/>
+              </w:rPr>
+            </w:r>
+            <w:r>
+              <w:rPr>
+                <w:sz w:val="23"/>
+              </w:rPr>
+              <w:t>mobile</w:t>
+            </w:r>
+          </w:p>
+        </w:tc>
+        <w:tc>
+          <w:tcPr>
+            <w:tcW w:type="dxa" w:w="1176"/>
+          </w:tcPr>
+          <w:p>
+            <w:pPr>
+              <w:spacing w:line="240" w:lineRule="auto" w:after="40"/>
+            </w:pPr>
+            <w:r>
+              <w:rPr>
+                <w:sz w:val="23"/>
+              </w:rPr>
+            </w:r>
+            <w:r>
+              <w:rPr>
+                <w:sz w:val="23"/>
+              </w:rPr>
+              <w:t>text + vision</w:t>
+            </w:r>
+          </w:p>
+        </w:tc>
+        <w:tc>
+          <w:tcPr>
+            <w:tcW w:type="dxa" w:w="1176"/>
+          </w:tcPr>
+          <w:p>
+            <w:pPr>
+              <w:spacing w:line="240" w:lineRule="auto" w:after="40"/>
+            </w:pPr>
+            <w:r>
+              <w:rPr>
+                <w:sz w:val="23"/>
+              </w:rPr>
+            </w:r>
+            <w:r>
+              <w:rPr>
+                <w:sz w:val="23"/>
+              </w:rPr>
+              <w:t>kiểm thử theo yêu cầu NL</w:t>
+            </w:r>
+          </w:p>
+        </w:tc>
+        <w:tc>
+          <w:tcPr>
+            <w:tcW w:type="dxa" w:w="1176"/>
+          </w:tcPr>
+          <w:p>
+            <w:pPr>
+              <w:spacing w:line="240" w:lineRule="auto" w:after="40"/>
+            </w:pPr>
+            <w:r>
+              <w:rPr>
+                <w:sz w:val="23"/>
+              </w:rPr>
+            </w:r>
+            <w:r>
+              <w:rPr>
+                <w:sz w:val="23"/>
+              </w:rPr>
+              <w:t>—</w:t>
+            </w:r>
+          </w:p>
+        </w:tc>
+        <w:tc>
+          <w:tcPr>
+            <w:tcW w:type="dxa" w:w="1176"/>
+          </w:tcPr>
+          <w:p>
+            <w:pPr>
+              <w:spacing w:line="240" w:lineRule="auto" w:after="40"/>
+            </w:pPr>
+            <w:r>
+              <w:rPr>
+                <w:sz w:val="23"/>
+              </w:rPr>
+            </w:r>
+            <w:r>
+              <w:rPr>
+                <w:sz w:val="23"/>
+              </w:rPr>
+              <w:t>—</w:t>
+            </w:r>
+          </w:p>
+        </w:tc>
+        <w:tc>
+          <w:tcPr>
+            <w:tcW w:type="dxa" w:w="1176"/>
+          </w:tcPr>
+          <w:p>
+            <w:pPr>
+              <w:spacing w:line="240" w:lineRule="auto" w:after="40"/>
+            </w:pPr>
+            <w:r>
+              <w:rPr>
+                <w:sz w:val="23"/>
+              </w:rPr>
+            </w:r>
+            <w:r>
+              <w:rPr>
+                <w:sz w:val="23"/>
+              </w:rPr>
+              <w:t>—</w:t>
+            </w:r>
+          </w:p>
+        </w:tc>
+      </w:tr>
+      <w:tr>
+        <w:tc>
+          <w:tcPr>
+            <w:tcW w:type="dxa" w:w="1176"/>
+          </w:tcPr>
+          <w:p>
+            <w:pPr>
+              <w:spacing w:line="240" w:lineRule="auto" w:after="40"/>
+            </w:pPr>
+            <w:r>
+              <w:rPr>
+                <w:sz w:val="23"/>
+              </w:rPr>
+            </w:r>
+            <w:r>
+              <w:rPr>
+                <w:sz w:val="23"/>
+              </w:rPr>
+              <w:t>[8]</w:t>
+            </w:r>
+          </w:p>
+        </w:tc>
+        <w:tc>
+          <w:tcPr>
+            <w:tcW w:type="dxa" w:w="1176"/>
+          </w:tcPr>
+          <w:p>
+            <w:pPr>
+              <w:spacing w:line="240" w:lineRule="auto" w:after="40"/>
+            </w:pPr>
+            <w:r>
+              <w:rPr>
+                <w:sz w:val="23"/>
+              </w:rPr>
+            </w:r>
+            <w:r>
+              <w:rPr>
+                <w:sz w:val="23"/>
+              </w:rPr>
+              <w:t>GTArena</w:t>
+            </w:r>
+          </w:p>
+        </w:tc>
+        <w:tc>
+          <w:tcPr>
+            <w:tcW w:type="dxa" w:w="1176"/>
+          </w:tcPr>
+          <w:p>
+            <w:pPr>
+              <w:spacing w:line="240" w:lineRule="auto" w:after="40"/>
+            </w:pPr>
+            <w:r>
+              <w:rPr>
+                <w:sz w:val="23"/>
+              </w:rPr>
+            </w:r>
+            <w:r>
+              <w:rPr>
+                <w:sz w:val="23"/>
+              </w:rPr>
+              <w:t>mobile</w:t>
+            </w:r>
+          </w:p>
+        </w:tc>
+        <w:tc>
+          <w:tcPr>
+            <w:tcW w:type="dxa" w:w="1176"/>
+          </w:tcPr>
+          <w:p>
+            <w:pPr>
+              <w:spacing w:line="240" w:lineRule="auto" w:after="40"/>
+            </w:pPr>
+            <w:r>
+              <w:rPr>
+                <w:sz w:val="23"/>
+              </w:rPr>
+            </w:r>
+            <w:r>
+              <w:rPr>
+                <w:sz w:val="23"/>
+              </w:rPr>
+              <w:t>vision</w:t>
+            </w:r>
+          </w:p>
+        </w:tc>
+        <w:tc>
+          <w:tcPr>
+            <w:tcW w:type="dxa" w:w="1176"/>
+          </w:tcPr>
+          <w:p>
+            <w:pPr>
+              <w:spacing w:line="240" w:lineRule="auto" w:after="40"/>
+            </w:pPr>
+            <w:r>
+              <w:rPr>
+                <w:sz w:val="23"/>
+              </w:rPr>
+            </w:r>
+            <w:r>
+              <w:rPr>
+                <w:sz w:val="23"/>
+              </w:rPr>
+              <w:t>benchmark thống nhất</w:t>
+            </w:r>
+          </w:p>
+        </w:tc>
+        <w:tc>
+          <w:tcPr>
+            <w:tcW w:type="dxa" w:w="1176"/>
+          </w:tcPr>
+          <w:p>
+            <w:pPr>
+              <w:spacing w:line="240" w:lineRule="auto" w:after="40"/>
+            </w:pPr>
+            <w:r>
+              <w:rPr>
+                <w:sz w:val="23"/>
+              </w:rPr>
+            </w:r>
+            <w:r>
+              <w:rPr>
+                <w:sz w:val="23"/>
+              </w:rPr>
+              <w:t>—</w:t>
+            </w:r>
+          </w:p>
+        </w:tc>
+        <w:tc>
+          <w:tcPr>
+            <w:tcW w:type="dxa" w:w="1176"/>
+          </w:tcPr>
+          <w:p>
+            <w:pPr>
+              <w:spacing w:line="240" w:lineRule="auto" w:after="40"/>
+            </w:pPr>
+            <w:r>
+              <w:rPr>
+                <w:sz w:val="23"/>
+              </w:rPr>
+            </w:r>
+            <w:r>
+              <w:rPr>
+                <w:sz w:val="23"/>
+              </w:rPr>
+              <w:t>—</w:t>
+            </w:r>
+          </w:p>
+        </w:tc>
+        <w:tc>
+          <w:tcPr>
+            <w:tcW w:type="dxa" w:w="1176"/>
+          </w:tcPr>
+          <w:p>
+            <w:pPr>
+              <w:spacing w:line="240" w:lineRule="auto" w:after="40"/>
+            </w:pPr>
+            <w:r>
+              <w:rPr>
+                <w:sz w:val="23"/>
+              </w:rPr>
+            </w:r>
+            <w:r>
+              <w:rPr>
+                <w:sz w:val="23"/>
+              </w:rPr>
+              <w:t>—</w:t>
+            </w:r>
+          </w:p>
+        </w:tc>
+      </w:tr>
+      <w:tr>
+        <w:tc>
+          <w:tcPr>
+            <w:tcW w:type="dxa" w:w="1176"/>
+          </w:tcPr>
+          <w:p>
+            <w:pPr>
+              <w:spacing w:line="240" w:lineRule="auto" w:after="40"/>
+            </w:pPr>
+            <w:r>
+              <w:rPr>
+                <w:sz w:val="23"/>
+              </w:rPr>
+            </w:r>
+            <w:r>
+              <w:rPr>
+                <w:sz w:val="23"/>
+              </w:rPr>
+              <w:t>[9]</w:t>
+            </w:r>
+          </w:p>
+        </w:tc>
+        <w:tc>
+          <w:tcPr>
+            <w:tcW w:type="dxa" w:w="1176"/>
+          </w:tcPr>
+          <w:p>
+            <w:pPr>
+              <w:spacing w:line="240" w:lineRule="auto" w:after="40"/>
+            </w:pPr>
+            <w:r>
+              <w:rPr>
+                <w:sz w:val="23"/>
+              </w:rPr>
+            </w:r>
+            <w:r>
+              <w:rPr>
+                <w:sz w:val="23"/>
+              </w:rPr>
+              <w:t>Temac</w:t>
+            </w:r>
+          </w:p>
+        </w:tc>
+        <w:tc>
+          <w:tcPr>
+            <w:tcW w:type="dxa" w:w="1176"/>
+          </w:tcPr>
+          <w:p>
+            <w:pPr>
+              <w:spacing w:line="240" w:lineRule="auto" w:after="40"/>
+            </w:pPr>
+            <w:r>
+              <w:rPr>
+                <w:sz w:val="23"/>
+              </w:rPr>
+            </w:r>
+            <w:r>
+              <w:rPr>
+                <w:sz w:val="23"/>
+              </w:rPr>
+              <w:t>web</w:t>
+            </w:r>
+          </w:p>
+        </w:tc>
+        <w:tc>
+          <w:tcPr>
+            <w:tcW w:type="dxa" w:w="1176"/>
+          </w:tcPr>
+          <w:p>
+            <w:pPr>
+              <w:spacing w:line="240" w:lineRule="auto" w:after="40"/>
+            </w:pPr>
+            <w:r>
+              <w:rPr>
+                <w:sz w:val="23"/>
+              </w:rPr>
+            </w:r>
+            <w:r>
+              <w:rPr>
+                <w:sz w:val="23"/>
+              </w:rPr>
+              <w:t>text</w:t>
+            </w:r>
+          </w:p>
+        </w:tc>
+        <w:tc>
+          <w:tcPr>
+            <w:tcW w:type="dxa" w:w="1176"/>
+          </w:tcPr>
+          <w:p>
+            <w:pPr>
+              <w:spacing w:line="240" w:lineRule="auto" w:after="40"/>
+            </w:pPr>
+            <w:r>
+              <w:rPr>
+                <w:sz w:val="23"/>
+              </w:rPr>
+            </w:r>
+            <w:r>
+              <w:rPr>
+                <w:sz w:val="23"/>
+              </w:rPr>
+              <w:t>đa agent tăng coverage</w:t>
+            </w:r>
+          </w:p>
+        </w:tc>
+        <w:tc>
+          <w:tcPr>
+            <w:tcW w:type="dxa" w:w="1176"/>
+          </w:tcPr>
+          <w:p>
+            <w:pPr>
+              <w:spacing w:line="240" w:lineRule="auto" w:after="40"/>
+            </w:pPr>
+            <w:r>
+              <w:rPr>
+                <w:sz w:val="23"/>
+              </w:rPr>
+            </w:r>
+            <w:r>
+              <w:rPr>
+                <w:sz w:val="23"/>
+              </w:rPr>
+              <w:t>—</w:t>
+            </w:r>
+          </w:p>
+        </w:tc>
+        <w:tc>
+          <w:tcPr>
+            <w:tcW w:type="dxa" w:w="1176"/>
+          </w:tcPr>
+          <w:p>
+            <w:pPr>
+              <w:spacing w:line="240" w:lineRule="auto" w:after="40"/>
+            </w:pPr>
+            <w:r>
+              <w:rPr>
+                <w:sz w:val="23"/>
+              </w:rPr>
+            </w:r>
+            <w:r>
+              <w:rPr>
+                <w:sz w:val="23"/>
+              </w:rPr>
+              <w:t>—</w:t>
+            </w:r>
+          </w:p>
+        </w:tc>
+        <w:tc>
+          <w:tcPr>
+            <w:tcW w:type="dxa" w:w="1176"/>
+          </w:tcPr>
+          <w:p>
+            <w:pPr>
+              <w:spacing w:line="240" w:lineRule="auto" w:after="40"/>
+            </w:pPr>
+            <w:r>
+              <w:rPr>
+                <w:sz w:val="23"/>
+              </w:rPr>
+            </w:r>
+            <w:r>
+              <w:rPr>
+                <w:sz w:val="23"/>
+              </w:rPr>
+              <w:t>—</w:t>
+            </w:r>
+          </w:p>
+        </w:tc>
+      </w:tr>
+      <w:tr>
+        <w:tc>
+          <w:tcPr>
+            <w:tcW w:type="dxa" w:w="1176"/>
+          </w:tcPr>
+          <w:p>
+            <w:pPr>
+              <w:spacing w:line="240" w:lineRule="auto" w:after="40"/>
+            </w:pPr>
+            <w:r>
+              <w:rPr>
+                <w:sz w:val="23"/>
+              </w:rPr>
+            </w:r>
+            <w:r>
+              <w:rPr>
+                <w:sz w:val="23"/>
+              </w:rPr>
+              <w:t>[10]</w:t>
+            </w:r>
+          </w:p>
+        </w:tc>
+        <w:tc>
+          <w:tcPr>
+            <w:tcW w:type="dxa" w:w="1176"/>
+          </w:tcPr>
+          <w:p>
+            <w:pPr>
+              <w:spacing w:line="240" w:lineRule="auto" w:after="40"/>
+            </w:pPr>
+            <w:r>
+              <w:rPr>
+                <w:sz w:val="23"/>
+              </w:rPr>
+            </w:r>
+            <w:r>
+              <w:rPr>
+                <w:sz w:val="23"/>
+              </w:rPr>
+              <w:t>NaviQAte</w:t>
+            </w:r>
+          </w:p>
+        </w:tc>
+        <w:tc>
+          <w:tcPr>
+            <w:tcW w:type="dxa" w:w="1176"/>
+          </w:tcPr>
+          <w:p>
+            <w:pPr>
+              <w:spacing w:line="240" w:lineRule="auto" w:after="40"/>
+            </w:pPr>
+            <w:r>
+              <w:rPr>
+                <w:sz w:val="23"/>
+              </w:rPr>
+            </w:r>
+            <w:r>
+              <w:rPr>
+                <w:sz w:val="23"/>
+              </w:rPr>
+              <w:t>web</w:t>
+            </w:r>
+          </w:p>
+        </w:tc>
+        <w:tc>
+          <w:tcPr>
+            <w:tcW w:type="dxa" w:w="1176"/>
+          </w:tcPr>
+          <w:p>
+            <w:pPr>
+              <w:spacing w:line="240" w:lineRule="auto" w:after="40"/>
+            </w:pPr>
+            <w:r>
+              <w:rPr>
+                <w:sz w:val="23"/>
+              </w:rPr>
+            </w:r>
+            <w:r>
+              <w:rPr>
+                <w:sz w:val="23"/>
+              </w:rPr>
+              <w:t>text + vision</w:t>
+            </w:r>
+          </w:p>
+        </w:tc>
+        <w:tc>
+          <w:tcPr>
+            <w:tcW w:type="dxa" w:w="1176"/>
+          </w:tcPr>
+          <w:p>
+            <w:pPr>
+              <w:spacing w:line="240" w:lineRule="auto" w:after="40"/>
+            </w:pPr>
+            <w:r>
+              <w:rPr>
+                <w:sz w:val="23"/>
+              </w:rPr>
+            </w:r>
+            <w:r>
+              <w:rPr>
+                <w:sz w:val="23"/>
+              </w:rPr>
+              <w:t>điều hướng theo chức năng</w:t>
+            </w:r>
+          </w:p>
+        </w:tc>
+        <w:tc>
+          <w:tcPr>
+            <w:tcW w:type="dxa" w:w="1176"/>
+          </w:tcPr>
+          <w:p>
+            <w:pPr>
+              <w:spacing w:line="240" w:lineRule="auto" w:after="40"/>
+            </w:pPr>
+            <w:r>
+              <w:rPr>
+                <w:sz w:val="23"/>
+              </w:rPr>
+            </w:r>
+            <w:r>
+              <w:rPr>
+                <w:sz w:val="23"/>
+              </w:rPr>
+              <w:t>—</w:t>
+            </w:r>
+          </w:p>
+        </w:tc>
+        <w:tc>
+          <w:tcPr>
+            <w:tcW w:type="dxa" w:w="1176"/>
+          </w:tcPr>
+          <w:p>
+            <w:pPr>
+              <w:spacing w:line="240" w:lineRule="auto" w:after="40"/>
+            </w:pPr>
+            <w:r>
+              <w:rPr>
+                <w:sz w:val="23"/>
+              </w:rPr>
+            </w:r>
+            <w:r>
+              <w:rPr>
+                <w:sz w:val="23"/>
+              </w:rPr>
+              <w:t>—</w:t>
+            </w:r>
+          </w:p>
+        </w:tc>
+        <w:tc>
+          <w:tcPr>
+            <w:tcW w:type="dxa" w:w="1176"/>
+          </w:tcPr>
+          <w:p>
+            <w:pPr>
+              <w:spacing w:line="240" w:lineRule="auto" w:after="40"/>
+            </w:pPr>
+            <w:r>
+              <w:rPr>
+                <w:sz w:val="23"/>
+              </w:rPr>
+            </w:r>
+            <w:r>
+              <w:rPr>
+                <w:sz w:val="23"/>
+              </w:rPr>
+              <w:t>—</w:t>
+            </w:r>
+          </w:p>
+        </w:tc>
+      </w:tr>
+      <w:tr>
+        <w:tc>
+          <w:tcPr>
+            <w:tcW w:type="dxa" w:w="1176"/>
+          </w:tcPr>
+          <w:p>
+            <w:pPr>
+              <w:spacing w:line="240" w:lineRule="auto" w:after="40"/>
+            </w:pPr>
+            <w:r>
+              <w:rPr>
+                <w:sz w:val="23"/>
+              </w:rPr>
+            </w:r>
+            <w:r>
+              <w:rPr>
+                <w:sz w:val="23"/>
+              </w:rPr>
+              <w:t>[11]</w:t>
+            </w:r>
+          </w:p>
+        </w:tc>
+        <w:tc>
+          <w:tcPr>
+            <w:tcW w:type="dxa" w:w="1176"/>
+          </w:tcPr>
+          <w:p>
+            <w:pPr>
+              <w:spacing w:line="240" w:lineRule="auto" w:after="40"/>
+            </w:pPr>
+            <w:r>
+              <w:rPr>
+                <w:sz w:val="23"/>
+              </w:rPr>
+            </w:r>
+            <w:r>
+              <w:rPr>
+                <w:sz w:val="23"/>
+              </w:rPr>
+              <w:t>AutoE2E (ICSE'25)</w:t>
+            </w:r>
+          </w:p>
+        </w:tc>
+        <w:tc>
+          <w:tcPr>
+            <w:tcW w:type="dxa" w:w="1176"/>
+          </w:tcPr>
+          <w:p>
+            <w:pPr>
+              <w:spacing w:line="240" w:lineRule="auto" w:after="40"/>
+            </w:pPr>
+            <w:r>
+              <w:rPr>
+                <w:sz w:val="23"/>
+              </w:rPr>
+            </w:r>
+            <w:r>
+              <w:rPr>
+                <w:sz w:val="23"/>
+              </w:rPr>
+              <w:t>web</w:t>
+            </w:r>
+          </w:p>
+        </w:tc>
+        <w:tc>
+          <w:tcPr>
+            <w:tcW w:type="dxa" w:w="1176"/>
+          </w:tcPr>
+          <w:p>
+            <w:pPr>
+              <w:spacing w:line="240" w:lineRule="auto" w:after="40"/>
+            </w:pPr>
+            <w:r>
+              <w:rPr>
+                <w:sz w:val="23"/>
+              </w:rPr>
+            </w:r>
+            <w:r>
+              <w:rPr>
+                <w:sz w:val="23"/>
+              </w:rPr>
+              <w:t>text</w:t>
+            </w:r>
+          </w:p>
+        </w:tc>
+        <w:tc>
+          <w:tcPr>
+            <w:tcW w:type="dxa" w:w="1176"/>
+          </w:tcPr>
+          <w:p>
+            <w:pPr>
+              <w:spacing w:line="240" w:lineRule="auto" w:after="40"/>
+            </w:pPr>
+            <w:r>
+              <w:rPr>
+                <w:sz w:val="23"/>
+              </w:rPr>
+            </w:r>
+            <w:r>
+              <w:rPr>
+                <w:sz w:val="23"/>
+              </w:rPr>
+              <w:t>sinh test E2E theo feature</w:t>
+            </w:r>
+          </w:p>
+        </w:tc>
+        <w:tc>
+          <w:tcPr>
+            <w:tcW w:type="dxa" w:w="1176"/>
+          </w:tcPr>
+          <w:p>
+            <w:pPr>
+              <w:spacing w:line="240" w:lineRule="auto" w:after="40"/>
+            </w:pPr>
+            <w:r>
+              <w:rPr>
+                <w:sz w:val="23"/>
+              </w:rPr>
+            </w:r>
+            <w:r>
+              <w:rPr>
+                <w:sz w:val="23"/>
+              </w:rPr>
+              <w:t>—</w:t>
+            </w:r>
+          </w:p>
+        </w:tc>
+        <w:tc>
+          <w:tcPr>
+            <w:tcW w:type="dxa" w:w="1176"/>
+          </w:tcPr>
+          <w:p>
+            <w:pPr>
+              <w:spacing w:line="240" w:lineRule="auto" w:after="40"/>
+            </w:pPr>
+            <w:r>
+              <w:rPr>
+                <w:sz w:val="23"/>
+              </w:rPr>
+            </w:r>
+            <w:r>
+              <w:rPr>
+                <w:sz w:val="23"/>
+              </w:rPr>
+              <w:t>—</w:t>
+            </w:r>
+          </w:p>
+        </w:tc>
+        <w:tc>
+          <w:tcPr>
+            <w:tcW w:type="dxa" w:w="1176"/>
+          </w:tcPr>
+          <w:p>
+            <w:pPr>
+              <w:spacing w:line="240" w:lineRule="auto" w:after="40"/>
+            </w:pPr>
+            <w:r>
+              <w:rPr>
+                <w:sz w:val="23"/>
+              </w:rPr>
+            </w:r>
+            <w:r>
+              <w:rPr>
+                <w:sz w:val="23"/>
+              </w:rPr>
+              <w:t>—</w:t>
+            </w:r>
+          </w:p>
+        </w:tc>
+      </w:tr>
+      <w:tr>
+        <w:tc>
+          <w:tcPr>
+            <w:tcW w:type="dxa" w:w="1176"/>
+          </w:tcPr>
+          <w:p>
+            <w:pPr>
+              <w:spacing w:line="240" w:lineRule="auto" w:after="40"/>
+            </w:pPr>
+            <w:r>
+              <w:rPr>
+                <w:sz w:val="23"/>
+              </w:rPr>
+            </w:r>
+            <w:r>
+              <w:rPr>
+                <w:sz w:val="23"/>
+              </w:rPr>
+              <w:t>[12]</w:t>
+            </w:r>
+          </w:p>
+        </w:tc>
+        <w:tc>
+          <w:tcPr>
+            <w:tcW w:type="dxa" w:w="1176"/>
+          </w:tcPr>
+          <w:p>
+            <w:pPr>
+              <w:spacing w:line="240" w:lineRule="auto" w:after="40"/>
+            </w:pPr>
+            <w:r>
+              <w:rPr>
+                <w:sz w:val="23"/>
+              </w:rPr>
+            </w:r>
+            <w:r>
+              <w:rPr>
+                <w:sz w:val="23"/>
+              </w:rPr>
+              <w:t>Nghiên cứu MLLM-oracle</w:t>
+            </w:r>
+          </w:p>
+        </w:tc>
+        <w:tc>
+          <w:tcPr>
+            <w:tcW w:type="dxa" w:w="1176"/>
+          </w:tcPr>
+          <w:p>
+            <w:pPr>
+              <w:spacing w:line="240" w:lineRule="auto" w:after="40"/>
+            </w:pPr>
+            <w:r>
+              <w:rPr>
+                <w:sz w:val="23"/>
+              </w:rPr>
+            </w:r>
+            <w:r>
+              <w:rPr>
+                <w:sz w:val="23"/>
+              </w:rPr>
+              <w:t>mobile</w:t>
+            </w:r>
+          </w:p>
+        </w:tc>
+        <w:tc>
+          <w:tcPr>
+            <w:tcW w:type="dxa" w:w="1176"/>
+          </w:tcPr>
+          <w:p>
+            <w:pPr>
+              <w:spacing w:line="240" w:lineRule="auto" w:after="40"/>
+            </w:pPr>
+            <w:r>
+              <w:rPr>
+                <w:sz w:val="23"/>
+              </w:rPr>
+            </w:r>
+            <w:r>
+              <w:rPr>
+                <w:sz w:val="23"/>
+              </w:rPr>
+              <w:t>vision</w:t>
+            </w:r>
+          </w:p>
+        </w:tc>
+        <w:tc>
+          <w:tcPr>
+            <w:tcW w:type="dxa" w:w="1176"/>
+          </w:tcPr>
+          <w:p>
+            <w:pPr>
+              <w:spacing w:line="240" w:lineRule="auto" w:after="40"/>
+            </w:pPr>
+            <w:r>
+              <w:rPr>
+                <w:sz w:val="23"/>
+              </w:rPr>
+            </w:r>
+            <w:r>
+              <w:rPr>
+                <w:sz w:val="23"/>
+              </w:rPr>
+              <w:t>oracle non-crash bug</w:t>
+            </w:r>
+          </w:p>
+        </w:tc>
+        <w:tc>
+          <w:tcPr>
+            <w:tcW w:type="dxa" w:w="1176"/>
+          </w:tcPr>
+          <w:p>
+            <w:pPr>
+              <w:spacing w:line="240" w:lineRule="auto" w:after="40"/>
+            </w:pPr>
+            <w:r>
+              <w:rPr>
+                <w:sz w:val="23"/>
+              </w:rPr>
+            </w:r>
+            <w:r>
+              <w:rPr>
+                <w:sz w:val="23"/>
+              </w:rPr>
+              <w:t>—</w:t>
+            </w:r>
+          </w:p>
+        </w:tc>
+        <w:tc>
+          <w:tcPr>
+            <w:tcW w:type="dxa" w:w="1176"/>
+          </w:tcPr>
+          <w:p>
+            <w:pPr>
+              <w:spacing w:line="240" w:lineRule="auto" w:after="40"/>
+            </w:pPr>
+            <w:r>
+              <w:rPr>
+                <w:sz w:val="23"/>
+              </w:rPr>
+            </w:r>
+            <w:r>
+              <w:rPr>
+                <w:sz w:val="23"/>
+              </w:rPr>
+              <w:t>—</w:t>
+            </w:r>
+          </w:p>
+        </w:tc>
+        <w:tc>
+          <w:tcPr>
+            <w:tcW w:type="dxa" w:w="1176"/>
+          </w:tcPr>
+          <w:p>
+            <w:pPr>
+              <w:spacing w:line="240" w:lineRule="auto" w:after="40"/>
+            </w:pPr>
+            <w:r>
+              <w:rPr>
+                <w:sz w:val="23"/>
+              </w:rPr>
+            </w:r>
+            <w:r>
+              <w:rPr>
+                <w:sz w:val="23"/>
+              </w:rPr>
+              <w:t>—</w:t>
+            </w:r>
+          </w:p>
+        </w:tc>
+      </w:tr>
+      <w:tr>
+        <w:tc>
+          <w:tcPr>
+            <w:tcW w:type="dxa" w:w="1176"/>
+          </w:tcPr>
+          <w:p>
+            <w:pPr>
+              <w:spacing w:line="240" w:lineRule="auto" w:after="40"/>
+            </w:pPr>
+            <w:r>
+              <w:rPr>
+                <w:sz w:val="23"/>
+              </w:rPr>
+            </w:r>
+            <w:r>
+              <w:rPr>
+                <w:sz w:val="23"/>
+              </w:rPr>
+              <w:t>[13]</w:t>
+            </w:r>
+          </w:p>
+        </w:tc>
+        <w:tc>
+          <w:tcPr>
+            <w:tcW w:type="dxa" w:w="1176"/>
+          </w:tcPr>
+          <w:p>
+            <w:pPr>
+              <w:spacing w:line="240" w:lineRule="auto" w:after="40"/>
+            </w:pPr>
+            <w:r>
+              <w:rPr>
+                <w:sz w:val="23"/>
+              </w:rPr>
+            </w:r>
+            <w:r>
+              <w:rPr>
+                <w:sz w:val="23"/>
+              </w:rPr>
+              <w:t>ITeM (ISSTA'25)</w:t>
+            </w:r>
+          </w:p>
+        </w:tc>
+        <w:tc>
+          <w:tcPr>
+            <w:tcW w:type="dxa" w:w="1176"/>
+          </w:tcPr>
+          <w:p>
+            <w:pPr>
+              <w:spacing w:line="240" w:lineRule="auto" w:after="40"/>
+            </w:pPr>
+            <w:r>
+              <w:rPr>
+                <w:sz w:val="23"/>
+              </w:rPr>
+            </w:r>
+            <w:r>
+              <w:rPr>
+                <w:sz w:val="23"/>
+              </w:rPr>
+              <w:t>mobile</w:t>
+            </w:r>
+          </w:p>
+        </w:tc>
+        <w:tc>
+          <w:tcPr>
+            <w:tcW w:type="dxa" w:w="1176"/>
+          </w:tcPr>
+          <w:p>
+            <w:pPr>
+              <w:spacing w:line="240" w:lineRule="auto" w:after="40"/>
+            </w:pPr>
+            <w:r>
+              <w:rPr>
+                <w:sz w:val="23"/>
+              </w:rPr>
+            </w:r>
+            <w:r>
+              <w:rPr>
+                <w:sz w:val="23"/>
+              </w:rPr>
+              <w:t>text</w:t>
+            </w:r>
+          </w:p>
+        </w:tc>
+        <w:tc>
+          <w:tcPr>
+            <w:tcW w:type="dxa" w:w="1176"/>
+          </w:tcPr>
+          <w:p>
+            <w:pPr>
+              <w:spacing w:line="240" w:lineRule="auto" w:after="40"/>
+            </w:pPr>
+            <w:r>
+              <w:rPr>
+                <w:sz w:val="23"/>
+              </w:rPr>
+            </w:r>
+            <w:r>
+              <w:rPr>
+                <w:sz w:val="23"/>
+              </w:rPr>
+              <w:t>migrate test theo ý định</w:t>
+            </w:r>
+          </w:p>
+        </w:tc>
+        <w:tc>
+          <w:tcPr>
+            <w:tcW w:type="dxa" w:w="1176"/>
+          </w:tcPr>
+          <w:p>
+            <w:pPr>
+              <w:spacing w:line="240" w:lineRule="auto" w:after="40"/>
+            </w:pPr>
+            <w:r>
+              <w:rPr>
+                <w:sz w:val="23"/>
+              </w:rPr>
+            </w:r>
+            <w:r>
+              <w:rPr>
+                <w:sz w:val="23"/>
+              </w:rPr>
+              <w:t>—</w:t>
+            </w:r>
+          </w:p>
+        </w:tc>
+        <w:tc>
+          <w:tcPr>
+            <w:tcW w:type="dxa" w:w="1176"/>
+          </w:tcPr>
+          <w:p>
+            <w:pPr>
+              <w:spacing w:line="240" w:lineRule="auto" w:after="40"/>
+            </w:pPr>
+            <w:r>
+              <w:rPr>
+                <w:sz w:val="23"/>
+              </w:rPr>
+            </w:r>
+            <w:r>
+              <w:rPr>
+                <w:sz w:val="23"/>
+              </w:rPr>
+              <w:t>△</w:t>
+            </w:r>
+          </w:p>
+        </w:tc>
+        <w:tc>
+          <w:tcPr>
+            <w:tcW w:type="dxa" w:w="1176"/>
+          </w:tcPr>
+          <w:p>
+            <w:pPr>
+              <w:spacing w:line="240" w:lineRule="auto" w:after="40"/>
+            </w:pPr>
+            <w:r>
+              <w:rPr>
+                <w:sz w:val="23"/>
+              </w:rPr>
+            </w:r>
+            <w:r>
+              <w:rPr>
+                <w:sz w:val="23"/>
+              </w:rPr>
+              <w:t>—</w:t>
+            </w:r>
+          </w:p>
+        </w:tc>
+      </w:tr>
+      <w:tr>
+        <w:tc>
+          <w:tcPr>
+            <w:tcW w:type="dxa" w:w="1176"/>
+          </w:tcPr>
+          <w:p>
+            <w:pPr>
+              <w:spacing w:line="240" w:lineRule="auto" w:after="40"/>
+            </w:pPr>
+            <w:r>
+              <w:rPr>
+                <w:sz w:val="23"/>
+              </w:rPr>
+            </w:r>
+            <w:r>
+              <w:rPr>
+                <w:sz w:val="23"/>
+              </w:rPr>
+              <w:t>[14]</w:t>
+            </w:r>
+          </w:p>
+        </w:tc>
+        <w:tc>
+          <w:tcPr>
+            <w:tcW w:type="dxa" w:w="1176"/>
+          </w:tcPr>
+          <w:p>
+            <w:pPr>
+              <w:spacing w:line="240" w:lineRule="auto" w:after="40"/>
+            </w:pPr>
+            <w:r>
+              <w:rPr>
+                <w:sz w:val="23"/>
+              </w:rPr>
+            </w:r>
+            <w:r>
+              <w:rPr>
+                <w:sz w:val="23"/>
+              </w:rPr>
+              <w:t>Guardian (ISSTA'24)</w:t>
+            </w:r>
+          </w:p>
+        </w:tc>
+        <w:tc>
+          <w:tcPr>
+            <w:tcW w:type="dxa" w:w="1176"/>
+          </w:tcPr>
+          <w:p>
+            <w:pPr>
+              <w:spacing w:line="240" w:lineRule="auto" w:after="40"/>
+            </w:pPr>
+            <w:r>
+              <w:rPr>
+                <w:sz w:val="23"/>
+              </w:rPr>
+            </w:r>
+            <w:r>
+              <w:rPr>
+                <w:sz w:val="23"/>
+              </w:rPr>
+              <w:t>mobile</w:t>
+            </w:r>
+          </w:p>
+        </w:tc>
+        <w:tc>
+          <w:tcPr>
+            <w:tcW w:type="dxa" w:w="1176"/>
+          </w:tcPr>
+          <w:p>
+            <w:pPr>
+              <w:spacing w:line="240" w:lineRule="auto" w:after="40"/>
+            </w:pPr>
+            <w:r>
+              <w:rPr>
+                <w:sz w:val="23"/>
+              </w:rPr>
+            </w:r>
+            <w:r>
+              <w:rPr>
+                <w:sz w:val="23"/>
+              </w:rPr>
+              <w:t>text</w:t>
+            </w:r>
+          </w:p>
+        </w:tc>
+        <w:tc>
+          <w:tcPr>
+            <w:tcW w:type="dxa" w:w="1176"/>
+          </w:tcPr>
+          <w:p>
+            <w:pPr>
+              <w:spacing w:line="240" w:lineRule="auto" w:after="40"/>
+            </w:pPr>
+            <w:r>
+              <w:rPr>
+                <w:sz w:val="23"/>
+              </w:rPr>
+            </w:r>
+            <w:r>
+              <w:rPr>
+                <w:sz w:val="23"/>
+              </w:rPr>
+              <w:t>kiểm soát runtime cho agent</w:t>
+            </w:r>
+          </w:p>
+        </w:tc>
+        <w:tc>
+          <w:tcPr>
+            <w:tcW w:type="dxa" w:w="1176"/>
+          </w:tcPr>
+          <w:p>
+            <w:pPr>
+              <w:spacing w:line="240" w:lineRule="auto" w:after="40"/>
+            </w:pPr>
+            <w:r>
+              <w:rPr>
+                <w:sz w:val="23"/>
+              </w:rPr>
+            </w:r>
+            <w:r>
+              <w:rPr>
+                <w:sz w:val="23"/>
+              </w:rPr>
+              <w:t>—</w:t>
+            </w:r>
+          </w:p>
+        </w:tc>
+        <w:tc>
+          <w:tcPr>
+            <w:tcW w:type="dxa" w:w="1176"/>
+          </w:tcPr>
+          <w:p>
+            <w:pPr>
+              <w:spacing w:line="240" w:lineRule="auto" w:after="40"/>
+            </w:pPr>
+            <w:r>
+              <w:rPr>
+                <w:sz w:val="23"/>
+              </w:rPr>
+            </w:r>
+            <w:r>
+              <w:rPr>
+                <w:sz w:val="23"/>
+              </w:rPr>
+              <w:t>—</w:t>
+            </w:r>
+          </w:p>
+        </w:tc>
+        <w:tc>
+          <w:tcPr>
+            <w:tcW w:type="dxa" w:w="1176"/>
+          </w:tcPr>
+          <w:p>
+            <w:pPr>
+              <w:spacing w:line="240" w:lineRule="auto" w:after="40"/>
+            </w:pPr>
+            <w:r>
+              <w:rPr>
+                <w:sz w:val="23"/>
+              </w:rPr>
+            </w:r>
+            <w:r>
+              <w:rPr>
+                <w:sz w:val="23"/>
+              </w:rPr>
+              <w:t>—</w:t>
+            </w:r>
+          </w:p>
+        </w:tc>
+      </w:tr>
+      <w:tr>
+        <w:tc>
+          <w:tcPr>
+            <w:tcW w:type="dxa" w:w="1176"/>
+          </w:tcPr>
+          <w:p>
+            <w:pPr>
+              <w:spacing w:line="240" w:lineRule="auto" w:after="40"/>
+            </w:pPr>
+            <w:r>
+              <w:rPr>
+                <w:sz w:val="23"/>
+              </w:rPr>
+            </w:r>
+            <w:r>
+              <w:rPr>
+                <w:sz w:val="23"/>
+              </w:rPr>
+              <w:t>[15]</w:t>
+            </w:r>
+          </w:p>
+        </w:tc>
+        <w:tc>
+          <w:tcPr>
+            <w:tcW w:type="dxa" w:w="1176"/>
+          </w:tcPr>
+          <w:p>
+            <w:pPr>
+              <w:spacing w:line="240" w:lineRule="auto" w:after="40"/>
+            </w:pPr>
+            <w:r>
+              <w:rPr>
+                <w:sz w:val="23"/>
+              </w:rPr>
+            </w:r>
+            <w:r>
+              <w:rPr>
+                <w:sz w:val="23"/>
+              </w:rPr>
+              <w:t>Survey vision-based (CSUR)</w:t>
+            </w:r>
+          </w:p>
+        </w:tc>
+        <w:tc>
+          <w:tcPr>
+            <w:tcW w:type="dxa" w:w="1176"/>
+          </w:tcPr>
+          <w:p>
+            <w:pPr>
+              <w:spacing w:line="240" w:lineRule="auto" w:after="40"/>
+            </w:pPr>
+            <w:r>
+              <w:rPr>
+                <w:sz w:val="23"/>
+              </w:rPr>
+            </w:r>
+            <w:r>
+              <w:rPr>
+                <w:sz w:val="23"/>
+              </w:rPr>
+              <w:t>mobile</w:t>
+            </w:r>
+          </w:p>
+        </w:tc>
+        <w:tc>
+          <w:tcPr>
+            <w:tcW w:type="dxa" w:w="1176"/>
+          </w:tcPr>
+          <w:p>
+            <w:pPr>
+              <w:spacing w:line="240" w:lineRule="auto" w:after="40"/>
+            </w:pPr>
+            <w:r>
+              <w:rPr>
+                <w:sz w:val="23"/>
+              </w:rPr>
+            </w:r>
+            <w:r>
+              <w:rPr>
+                <w:sz w:val="23"/>
+              </w:rPr>
+              <w:t>vision</w:t>
+            </w:r>
+          </w:p>
+        </w:tc>
+        <w:tc>
+          <w:tcPr>
+            <w:tcW w:type="dxa" w:w="1176"/>
+          </w:tcPr>
+          <w:p>
+            <w:pPr>
+              <w:spacing w:line="240" w:lineRule="auto" w:after="40"/>
+            </w:pPr>
+            <w:r>
+              <w:rPr>
+                <w:sz w:val="23"/>
+              </w:rPr>
+            </w:r>
+            <w:r>
+              <w:rPr>
+                <w:sz w:val="23"/>
+              </w:rPr>
+              <w:t>khảo sát tiền-LLM</w:t>
+            </w:r>
+          </w:p>
+        </w:tc>
+        <w:tc>
+          <w:tcPr>
+            <w:tcW w:type="dxa" w:w="1176"/>
+          </w:tcPr>
+          <w:p>
+            <w:pPr>
+              <w:spacing w:line="240" w:lineRule="auto" w:after="40"/>
+            </w:pPr>
+            <w:r>
+              <w:rPr>
+                <w:sz w:val="23"/>
+              </w:rPr>
+            </w:r>
+            <w:r>
+              <w:rPr>
+                <w:sz w:val="23"/>
+              </w:rPr>
+              <w:t>—</w:t>
+            </w:r>
+          </w:p>
+        </w:tc>
+        <w:tc>
+          <w:tcPr>
+            <w:tcW w:type="dxa" w:w="1176"/>
+          </w:tcPr>
+          <w:p>
+            <w:pPr>
+              <w:spacing w:line="240" w:lineRule="auto" w:after="40"/>
+            </w:pPr>
+            <w:r>
+              <w:rPr>
+                <w:sz w:val="23"/>
+              </w:rPr>
+            </w:r>
+            <w:r>
+              <w:rPr>
+                <w:sz w:val="23"/>
+              </w:rPr>
+              <w:t>—</w:t>
+            </w:r>
+          </w:p>
+        </w:tc>
+        <w:tc>
+          <w:tcPr>
+            <w:tcW w:type="dxa" w:w="1176"/>
+          </w:tcPr>
+          <w:p>
+            <w:pPr>
+              <w:spacing w:line="240" w:lineRule="auto" w:after="40"/>
+            </w:pPr>
+            <w:r>
+              <w:rPr>
+                <w:sz w:val="23"/>
+              </w:rPr>
+            </w:r>
+            <w:r>
+              <w:rPr>
+                <w:sz w:val="23"/>
+              </w:rPr>
+              <w:t>—</w:t>
+            </w:r>
+          </w:p>
+        </w:tc>
+      </w:tr>
+      <w:tr>
+        <w:tc>
+          <w:tcPr>
+            <w:tcW w:type="dxa" w:w="1176"/>
+          </w:tcPr>
+          <w:p>
+            <w:pPr>
+              <w:spacing w:line="240" w:lineRule="auto" w:after="40"/>
+            </w:pPr>
+            <w:r>
+              <w:rPr>
+                <w:sz w:val="23"/>
+              </w:rPr>
+            </w:r>
+            <w:r>
+              <w:rPr>
+                <w:sz w:val="23"/>
+              </w:rPr>
+              <w:t>—</w:t>
+            </w:r>
+          </w:p>
+        </w:tc>
+        <w:tc>
+          <w:tcPr>
+            <w:tcW w:type="dxa" w:w="1176"/>
+          </w:tcPr>
+          <w:p>
+            <w:pPr>
+              <w:spacing w:line="240" w:lineRule="auto" w:after="40"/>
+            </w:pPr>
+            <w:r>
+              <w:rPr>
+                <w:sz w:val="23"/>
+              </w:rPr>
+            </w:r>
+            <w:r>
+              <w:rPr>
+                <w:b/>
+                <w:sz w:val="23"/>
+              </w:rPr>
+              <w:t>Đồ án này</w:t>
+            </w:r>
+          </w:p>
+        </w:tc>
+        <w:tc>
+          <w:tcPr>
+            <w:tcW w:type="dxa" w:w="1176"/>
+          </w:tcPr>
+          <w:p>
+            <w:pPr>
+              <w:spacing w:line="240" w:lineRule="auto" w:after="40"/>
+            </w:pPr>
+            <w:r>
+              <w:rPr>
+                <w:sz w:val="23"/>
+              </w:rPr>
+            </w:r>
+            <w:r>
+              <w:rPr>
+                <w:b/>
+                <w:sz w:val="23"/>
+              </w:rPr>
+              <w:t>web</w:t>
+            </w:r>
+          </w:p>
+        </w:tc>
+        <w:tc>
+          <w:tcPr>
+            <w:tcW w:type="dxa" w:w="1176"/>
+          </w:tcPr>
+          <w:p>
+            <w:pPr>
+              <w:spacing w:line="240" w:lineRule="auto" w:after="40"/>
+            </w:pPr>
+            <w:r>
+              <w:rPr>
+                <w:sz w:val="23"/>
+              </w:rPr>
+            </w:r>
+            <w:r>
+              <w:rPr>
+                <w:b/>
+                <w:sz w:val="23"/>
+              </w:rPr>
+              <w:t>cả hai (đối chứng)</w:t>
+            </w:r>
+          </w:p>
+        </w:tc>
+        <w:tc>
+          <w:tcPr>
+            <w:tcW w:type="dxa" w:w="1176"/>
+          </w:tcPr>
+          <w:p>
+            <w:pPr>
+              <w:spacing w:line="240" w:lineRule="auto" w:after="40"/>
+            </w:pPr>
+            <w:r>
+              <w:rPr>
+                <w:sz w:val="23"/>
+              </w:rPr>
+            </w:r>
+            <w:r>
+              <w:rPr>
+                <w:b/>
+                <w:sz w:val="23"/>
+              </w:rPr>
+              <w:t>so sánh định lượng 2 phương pháp + RBAC + masking</w:t>
+            </w:r>
+          </w:p>
+        </w:tc>
+        <w:tc>
+          <w:tcPr>
+            <w:tcW w:type="dxa" w:w="1176"/>
+          </w:tcPr>
+          <w:p>
+            <w:pPr>
+              <w:spacing w:line="240" w:lineRule="auto" w:after="40"/>
+            </w:pPr>
+            <w:r>
+              <w:rPr>
+                <w:sz w:val="23"/>
+              </w:rPr>
+            </w:r>
+            <w:r>
+              <w:rPr>
+                <w:b/>
+                <w:sz w:val="23"/>
+              </w:rPr>
+              <w:t>✓</w:t>
+            </w:r>
+          </w:p>
+        </w:tc>
+        <w:tc>
+          <w:tcPr>
+            <w:tcW w:type="dxa" w:w="1176"/>
+          </w:tcPr>
+          <w:p>
+            <w:pPr>
+              <w:spacing w:line="240" w:lineRule="auto" w:after="40"/>
+            </w:pPr>
+            <w:r>
+              <w:rPr>
+                <w:sz w:val="23"/>
+              </w:rPr>
+            </w:r>
+            <w:r>
+              <w:rPr>
+                <w:b/>
+                <w:sz w:val="23"/>
+              </w:rPr>
+              <w:t>✓</w:t>
+            </w:r>
+          </w:p>
+        </w:tc>
+        <w:tc>
+          <w:tcPr>
+            <w:tcW w:type="dxa" w:w="1176"/>
+          </w:tcPr>
+          <w:p>
+            <w:pPr>
+              <w:spacing w:line="240" w:lineRule="auto" w:after="40"/>
+            </w:pPr>
+            <w:r>
+              <w:rPr>
+                <w:sz w:val="23"/>
+              </w:rPr>
+            </w:r>
+            <w:r>
+              <w:rPr>
+                <w:b/>
+                <w:sz w:val="23"/>
+              </w:rPr>
+              <w:t>✓</w:t>
+            </w:r>
+          </w:p>
+        </w:tc>
+      </w:tr>
+    </w:tbl>
+    <w:p/>
+    <w:p>
+      <w:r>
+        <w:t>Chú giải: ✓ = có, trực tiếp; △ = chạm một phần ([6] chỉ đo chi phí vận hành $/giờ, không đo chi phí bảo trì; [13] migrate test giữa các app — gần khái niệm bảo trì nhưng không đo theo cặp phương pháp trên cùng ứng dụng); — = không đề cập.</w:t>
       </w:r>
     </w:p>
     <w:p>
@@ -1561,10 +4484,72 @@
       <w:r>
         <w:rPr>
           <w:i/>
-          <w:color w:val="606060"/>
-          <w:sz w:val="22"/>
         </w:rPr>
-        <w:t>⟪Chỗ chèn: HÌNH 3.1 — Sơ đồ tổng thể: App (V0–V3) → 2 bộ test song song → harness ma trận {phương pháp × biến thể × 5 lặp} → CSV → phân tích/biểu đồ; hai khối mở rộng: RBAC (RQ3) và masking (RQ4).⟫</w:t>
+        <w:t>Hình 3.1</w:t>
+      </w:r>
+      <w:r>
+        <w:t xml:space="preserve"> (</w:t>
+      </w:r>
+      <w:r>
+        <w:rPr>
+          <w:rFonts w:ascii="Consolas" w:hAnsi="Consolas"/>
+          <w:sz w:val="23"/>
+        </w:rPr>
+        <w:t>fig-design-pipeline.png</w:t>
+      </w:r>
+      <w:r>
+        <w:t>) — sơ đồ tổng thể: ứng dụng (V0–V3) → hai bộ test song song → harness ma trận {phương pháp × biến thể × 5 lặp} → CSV → phân tích; hai khối mở rộng RBAC (RQ3) và masking (RQ4) đổ số liệu vào cùng kho dữ liệu thô.</w:t>
+      </w:r>
+    </w:p>
+    <w:p>
+      <w:pPr>
+        <w:jc w:val="center"/>
+      </w:pPr>
+      <w:r>
+        <w:drawing>
+          <wp:inline xmlns:a="http://schemas.openxmlformats.org/drawingml/2006/main" xmlns:pic="http://schemas.openxmlformats.org/drawingml/2006/picture">
+            <wp:extent cx="5394960" cy="2712001"/>
+            <wp:docPr id="1" name="Picture 1"/>
+            <wp:cNvGraphicFramePr>
+              <a:graphicFrameLocks noChangeAspect="1"/>
+            </wp:cNvGraphicFramePr>
+            <a:graphic>
+              <a:graphicData uri="http://schemas.openxmlformats.org/drawingml/2006/picture">
+                <pic:pic>
+                  <pic:nvPicPr>
+                    <pic:cNvPr id="0" name="fig-design-pipeline.png"/>
+                    <pic:cNvPicPr/>
+                  </pic:nvPicPr>
+                  <pic:blipFill>
+                    <a:blip r:embed="rId9"/>
+                    <a:stretch>
+                      <a:fillRect/>
+                    </a:stretch>
+                  </pic:blipFill>
+                  <pic:spPr>
+                    <a:xfrm>
+                      <a:off x="0" y="0"/>
+                      <a:ext cx="5394960" cy="2712001"/>
+                    </a:xfrm>
+                    <a:prstGeom prst="rect"/>
+                  </pic:spPr>
+                </pic:pic>
+              </a:graphicData>
+            </a:graphic>
+          </wp:inline>
+        </w:drawing>
+      </w:r>
+    </w:p>
+    <w:p>
+      <w:pPr>
+        <w:jc w:val="center"/>
+      </w:pPr>
+      <w:r>
+        <w:rPr>
+          <w:i/>
+          <w:sz w:val="23"/>
+        </w:rPr>
+        <w:t>Hình 3.1 — Sơ đồ tổng thể thiết kế thực nghiệm</w:t>
       </w:r>
     </w:p>
     <w:p>
@@ -1743,7 +4728,7 @@
         <w:drawing>
           <wp:inline xmlns:a="http://schemas.openxmlformats.org/drawingml/2006/main" xmlns:pic="http://schemas.openxmlformats.org/drawingml/2006/picture">
             <wp:extent cx="5303520" cy="4056364"/>
-            <wp:docPr id="1" name="Picture 1"/>
+            <wp:docPr id="2" name="Picture 2"/>
             <wp:cNvGraphicFramePr>
               <a:graphicFrameLocks noChangeAspect="1"/>
             </wp:cNvGraphicFramePr>
@@ -1755,7 +4740,7 @@
                     <pic:cNvPicPr/>
                   </pic:nvPicPr>
                   <pic:blipFill>
-                    <a:blip r:embed="rId9"/>
+                    <a:blip r:embed="rId10"/>
                     <a:stretch>
                       <a:fillRect/>
                     </a:stretch>
@@ -2208,7 +5193,7 @@
         <w:drawing>
           <wp:inline xmlns:a="http://schemas.openxmlformats.org/drawingml/2006/main" xmlns:pic="http://schemas.openxmlformats.org/drawingml/2006/picture">
             <wp:extent cx="4206240" cy="3217116"/>
-            <wp:docPr id="2" name="Picture 2"/>
+            <wp:docPr id="3" name="Picture 3"/>
             <wp:cNvGraphicFramePr>
               <a:graphicFrameLocks noChangeAspect="1"/>
             </wp:cNvGraphicFramePr>
@@ -2217,57 +5202,6 @@
                 <pic:pic>
                   <pic:nvPicPr>
                     <pic:cNvPr id="0" name="products-v0.png"/>
-                    <pic:cNvPicPr/>
-                  </pic:nvPicPr>
-                  <pic:blipFill>
-                    <a:blip r:embed="rId9"/>
-                    <a:stretch>
-                      <a:fillRect/>
-                    </a:stretch>
-                  </pic:blipFill>
-                  <pic:spPr>
-                    <a:xfrm>
-                      <a:off x="0" y="0"/>
-                      <a:ext cx="4206240" cy="3217116"/>
-                    </a:xfrm>
-                    <a:prstGeom prst="rect"/>
-                  </pic:spPr>
-                </pic:pic>
-              </a:graphicData>
-            </a:graphic>
-          </wp:inline>
-        </w:drawing>
-      </w:r>
-    </w:p>
-    <w:p>
-      <w:pPr>
-        <w:jc w:val="center"/>
-      </w:pPr>
-      <w:r>
-        <w:rPr>
-          <w:i/>
-          <w:sz w:val="23"/>
-        </w:rPr>
-        <w:t>V0 — gốc</w:t>
-      </w:r>
-    </w:p>
-    <w:p>
-      <w:pPr>
-        <w:jc w:val="center"/>
-      </w:pPr>
-      <w:r>
-        <w:drawing>
-          <wp:inline xmlns:a="http://schemas.openxmlformats.org/drawingml/2006/main" xmlns:pic="http://schemas.openxmlformats.org/drawingml/2006/picture">
-            <wp:extent cx="4206240" cy="3217116"/>
-            <wp:docPr id="3" name="Picture 3"/>
-            <wp:cNvGraphicFramePr>
-              <a:graphicFrameLocks noChangeAspect="1"/>
-            </wp:cNvGraphicFramePr>
-            <a:graphic>
-              <a:graphicData uri="http://schemas.openxmlformats.org/drawingml/2006/picture">
-                <pic:pic>
-                  <pic:nvPicPr>
-                    <pic:cNvPr id="0" name="products-v1.png"/>
                     <pic:cNvPicPr/>
                   </pic:nvPicPr>
                   <pic:blipFill>
@@ -2299,7 +5233,7 @@
           <w:i/>
           <w:sz w:val="23"/>
         </w:rPr>
-        <w:t>V1 — dark theme</w:t>
+        <w:t>V0 — gốc</w:t>
       </w:r>
     </w:p>
     <w:p>
@@ -2309,8 +5243,59 @@
       <w:r>
         <w:drawing>
           <wp:inline xmlns:a="http://schemas.openxmlformats.org/drawingml/2006/main" xmlns:pic="http://schemas.openxmlformats.org/drawingml/2006/picture">
+            <wp:extent cx="4206240" cy="3217116"/>
+            <wp:docPr id="4" name="Picture 4"/>
+            <wp:cNvGraphicFramePr>
+              <a:graphicFrameLocks noChangeAspect="1"/>
+            </wp:cNvGraphicFramePr>
+            <a:graphic>
+              <a:graphicData uri="http://schemas.openxmlformats.org/drawingml/2006/picture">
+                <pic:pic>
+                  <pic:nvPicPr>
+                    <pic:cNvPr id="0" name="products-v1.png"/>
+                    <pic:cNvPicPr/>
+                  </pic:nvPicPr>
+                  <pic:blipFill>
+                    <a:blip r:embed="rId11"/>
+                    <a:stretch>
+                      <a:fillRect/>
+                    </a:stretch>
+                  </pic:blipFill>
+                  <pic:spPr>
+                    <a:xfrm>
+                      <a:off x="0" y="0"/>
+                      <a:ext cx="4206240" cy="3217116"/>
+                    </a:xfrm>
+                    <a:prstGeom prst="rect"/>
+                  </pic:spPr>
+                </pic:pic>
+              </a:graphicData>
+            </a:graphic>
+          </wp:inline>
+        </w:drawing>
+      </w:r>
+    </w:p>
+    <w:p>
+      <w:pPr>
+        <w:jc w:val="center"/>
+      </w:pPr>
+      <w:r>
+        <w:rPr>
+          <w:i/>
+          <w:sz w:val="23"/>
+        </w:rPr>
+        <w:t>V1 — dark theme</w:t>
+      </w:r>
+    </w:p>
+    <w:p>
+      <w:pPr>
+        <w:jc w:val="center"/>
+      </w:pPr>
+      <w:r>
+        <w:drawing>
+          <wp:inline xmlns:a="http://schemas.openxmlformats.org/drawingml/2006/main" xmlns:pic="http://schemas.openxmlformats.org/drawingml/2006/picture">
             <wp:extent cx="4206240" cy="3410998"/>
-            <wp:docPr id="4" name="Picture 4"/>
+            <wp:docPr id="5" name="Picture 5"/>
             <wp:cNvGraphicFramePr>
               <a:graphicFrameLocks noChangeAspect="1"/>
             </wp:cNvGraphicFramePr>
@@ -2322,7 +5307,7 @@
                     <pic:cNvPicPr/>
                   </pic:nvPicPr>
                   <pic:blipFill>
-                    <a:blip r:embed="rId11"/>
+                    <a:blip r:embed="rId12"/>
                     <a:stretch>
                       <a:fillRect/>
                     </a:stretch>
@@ -2361,7 +5346,7 @@
         <w:drawing>
           <wp:inline xmlns:a="http://schemas.openxmlformats.org/drawingml/2006/main" xmlns:pic="http://schemas.openxmlformats.org/drawingml/2006/picture">
             <wp:extent cx="4206240" cy="3217116"/>
-            <wp:docPr id="5" name="Picture 5"/>
+            <wp:docPr id="6" name="Picture 6"/>
             <wp:cNvGraphicFramePr>
               <a:graphicFrameLocks noChangeAspect="1"/>
             </wp:cNvGraphicFramePr>
@@ -2373,7 +5358,7 @@
                     <pic:cNvPicPr/>
                   </pic:nvPicPr>
                   <pic:blipFill>
-                    <a:blip r:embed="rId12"/>
+                    <a:blip r:embed="rId13"/>
                     <a:stretch>
                       <a:fillRect/>
                     </a:stretch>
@@ -3566,7 +6551,7 @@
         <w:drawing>
           <wp:inline xmlns:a="http://schemas.openxmlformats.org/drawingml/2006/main" xmlns:pic="http://schemas.openxmlformats.org/drawingml/2006/picture">
             <wp:extent cx="5394960" cy="3236976"/>
-            <wp:docPr id="6" name="Picture 6"/>
+            <wp:docPr id="7" name="Picture 7"/>
             <wp:cNvGraphicFramePr>
               <a:graphicFrameLocks noChangeAspect="1"/>
             </wp:cNvGraphicFramePr>
@@ -3578,7 +6563,7 @@
                     <pic:cNvPicPr/>
                   </pic:nvPicPr>
                   <pic:blipFill>
-                    <a:blip r:embed="rId13"/>
+                    <a:blip r:embed="rId14"/>
                     <a:stretch>
                       <a:fillRect/>
                     </a:stretch>
@@ -3617,7 +6602,7 @@
         <w:drawing>
           <wp:inline xmlns:a="http://schemas.openxmlformats.org/drawingml/2006/main" xmlns:pic="http://schemas.openxmlformats.org/drawingml/2006/picture">
             <wp:extent cx="5394960" cy="2385140"/>
-            <wp:docPr id="7" name="Picture 7"/>
+            <wp:docPr id="8" name="Picture 8"/>
             <wp:cNvGraphicFramePr>
               <a:graphicFrameLocks noChangeAspect="1"/>
             </wp:cNvGraphicFramePr>
@@ -3629,7 +6614,7 @@
                     <pic:cNvPicPr/>
                   </pic:nvPicPr>
                   <pic:blipFill>
-                    <a:blip r:embed="rId14"/>
+                    <a:blip r:embed="rId15"/>
                     <a:stretch>
                       <a:fillRect/>
                     </a:stretch>
@@ -4117,7 +7102,7 @@
         <w:drawing>
           <wp:inline xmlns:a="http://schemas.openxmlformats.org/drawingml/2006/main" xmlns:pic="http://schemas.openxmlformats.org/drawingml/2006/picture">
             <wp:extent cx="5394960" cy="1659988"/>
-            <wp:docPr id="8" name="Picture 8"/>
+            <wp:docPr id="9" name="Picture 9"/>
             <wp:cNvGraphicFramePr>
               <a:graphicFrameLocks noChangeAspect="1"/>
             </wp:cNvGraphicFramePr>
@@ -4129,7 +7114,7 @@
                     <pic:cNvPicPr/>
                   </pic:nvPicPr>
                   <pic:blipFill>
-                    <a:blip r:embed="rId15"/>
+                    <a:blip r:embed="rId16"/>
                     <a:stretch>
                       <a:fillRect/>
                     </a:stretch>
@@ -4957,7 +7942,7 @@
         <w:drawing>
           <wp:inline xmlns:a="http://schemas.openxmlformats.org/drawingml/2006/main" xmlns:pic="http://schemas.openxmlformats.org/drawingml/2006/picture">
             <wp:extent cx="5394960" cy="2044406"/>
-            <wp:docPr id="9" name="Picture 9"/>
+            <wp:docPr id="10" name="Picture 10"/>
             <wp:cNvGraphicFramePr>
               <a:graphicFrameLocks noChangeAspect="1"/>
             </wp:cNvGraphicFramePr>
@@ -4969,7 +7954,7 @@
                     <pic:cNvPicPr/>
                   </pic:nvPicPr>
                   <pic:blipFill>
-                    <a:blip r:embed="rId16"/>
+                    <a:blip r:embed="rId17"/>
                     <a:stretch>
                       <a:fillRect/>
                     </a:stretch>
@@ -5389,7 +8374,7 @@
         <w:drawing>
           <wp:inline xmlns:a="http://schemas.openxmlformats.org/drawingml/2006/main" xmlns:pic="http://schemas.openxmlformats.org/drawingml/2006/picture">
             <wp:extent cx="5394960" cy="2157984"/>
-            <wp:docPr id="10" name="Picture 10"/>
+            <wp:docPr id="11" name="Picture 11"/>
             <wp:cNvGraphicFramePr>
               <a:graphicFrameLocks noChangeAspect="1"/>
             </wp:cNvGraphicFramePr>
@@ -5401,7 +8386,7 @@
                     <pic:cNvPicPr/>
                   </pic:nvPicPr>
                   <pic:blipFill>
-                    <a:blip r:embed="rId17"/>
+                    <a:blip r:embed="rId18"/>
                     <a:stretch>
                       <a:fillRect/>
                     </a:stretch>

</xml_diff>

<commit_message>
Lock worst-case baseline positioning (option a)
Threats item 4.7-(3) is now a definitive design statement: the
locator suite is the intentional lower bound of the locator
approach, with two arguments (data-testid requires app access;
group-D widgets have no semantic anchor, so best practice does
not change their outcome), and a best-practice second baseline
stays in future work 5.4. The advisor-meeting item 3 becomes an
FYI with the build-it-anyway fallback; slide notes, the report
coordinator and the plan status were synced, and the DOCX was
regenerated. The report has no content TODOs left.
</commit_message>
<xml_diff>
--- a/docs/bao-cao/bao-cao-doan.docx
+++ b/docs/bao-cao/bao-cao-doan.docx
@@ -6344,7 +6344,7 @@
           <w:color w:val="606060"/>
           <w:sz w:val="22"/>
         </w:rPr>
-        <w:t>Bản nháp sinh ngày 09/07/2026 từ số liệu chính thức trong repo. Mọi con số đều tái lập được: bảng tổng hợp `results/analysis-summary.md` và 5 hình `results/figures/` do `harness/make-figures.py` sinh từ `results/raw/matrix-runs.csv` + `masking/generated/grounding-results.csv`. Chỗ đánh dấu ⚠️ TODO cần bổ sung/quyết định trước khi đưa vào báo cáo chính thức.</w:t>
+        <w:t>Bản nháp sinh ngày 09/07/2026 từ số liệu chính thức trong repo. Mọi con số đều tái lập được: bảng tổng hợp `results/analysis-summary.md` và 5 hình `results/figures/` do `harness/make-figures.py` sinh từ `results/raw/matrix-runs.csv` + `masking/generated/grounding-results.csv`. Nội dung đã chốt đầy đủ (09/07/2026) — không còn TODO; chỉ còn việc định dạng theo template khoa khi ghép bản nộp (ghi chú cuối chương).</w:t>
       </w:r>
     </w:p>
     <w:p>
@@ -9070,10 +9070,10 @@
         <w:rPr>
           <w:b/>
         </w:rPr>
-        <w:t>Internal — baseline chủ ý dùng selector giòn:</w:t>
-      </w:r>
-      <w:r>
-        <w:t xml:space="preserve"> suite locator dùng nth-child/XPath-text cố định, đại diện cho lớp test giòn phổ biến; một baseline dùng best practice (</w:t>
+        <w:t>Internal — baseline là "trường hợp xấu" (worst case) có chủ ý:</w:t>
+      </w:r>
+      <w:r>
+        <w:t xml:space="preserve"> suite locator dùng selector cấu trúc (nth-child) và neo văn bản (XPath text) cố định — đại diện cho lớp test giòn phổ biến trong thực tế, và là cận dưới về độ bền vững của phương pháp locator. Một baseline theo best practice (</w:t>
       </w:r>
       <w:r>
         <w:rPr>
@@ -9093,7 +9093,17 @@
         <w:t>data-testid</w:t>
       </w:r>
       <w:r>
-        <w:t>) sẽ bền hơn trước V2/V3 — kết quả RQ1/RQ2 phải đọc trong phạm vi lớp selector này. ⚠️ TODO: cân nhắc 1 đoạn định vị rõ "worst-case baseline" hay bổ sung biến thể baseline bền (nếu còn giờ).</w:t>
+        <w:t xml:space="preserve">) sẽ bền hơn trước V3 (đổi nhãn) và một phần V2; tuy nhiên (i) </w:t>
+      </w:r>
+      <w:r>
+        <w:rPr>
+          <w:rFonts w:ascii="Consolas" w:hAnsi="Consolas"/>
+          <w:sz w:val="23"/>
+        </w:rPr>
+        <w:t>data-testid</w:t>
+      </w:r>
+      <w:r>
+        <w:t xml:space="preserve"> đòi quyền sửa mã ứng dụng — không phải lúc nào cũng có trong kiểm thử thực tế, và (ii) nhóm test D nhắm vào các thành phần không có nhãn ngữ nghĩa (icon SVG trần, canvas, div thuần) — nơi selector cấu trúc gần như là lựa chọn duy nhất và best practice không thay đổi được kết cục. Vì vậy kết quả RQ1/RQ2 phải được đọc trong phạm vi lớp selector này: khoảng cách so với VLM là khoảng cách với cận dưới của locator, không phải với mọi bộ test locator. Việc bổ sung một baseline best-practice làm "cận trên" được ghi ở hướng phát triển (mục 5.4).</w:t>
       </w:r>
     </w:p>
     <w:p>
@@ -9158,27 +9168,7 @@
     </w:p>
     <w:p>
       <w:r>
-        <w:t xml:space="preserve">⚠️ TODO tổng khi chuyển vào báo cáo chính thức: (1) chèn file hình từ </w:t>
-      </w:r>
-      <w:r>
-        <w:rPr>
-          <w:rFonts w:ascii="Consolas" w:hAnsi="Consolas"/>
-          <w:sz w:val="23"/>
-        </w:rPr>
-        <w:t>results/figures/</w:t>
-      </w:r>
-      <w:r>
-        <w:t xml:space="preserve"> vào đúng vị trí Hình 4.1–4.5 và đánh số lại bảng theo template của khoa; (2) mục 4.7-(3): chốt cách định vị "worst-case baseline" sau buổi trao đổi GVHD (</w:t>
-      </w:r>
-      <w:r>
-        <w:rPr>
-          <w:rFonts w:ascii="Consolas" w:hAnsi="Consolas"/>
-          <w:sz w:val="23"/>
-        </w:rPr>
-        <w:t>docs/gvhd-trao-doi.md</w:t>
-      </w:r>
-      <w:r>
-        <w:t xml:space="preserve"> mục 3); (3) khi Chương 2 hoàn thiện, thêm trích dẫn chéo tại 4.6 (GPTDroid [2], VETL [3], VisionDroid/Trident [4], ITeM [13] cho luận điểm "test theo ý định", NaviQAte [10] cho mức trần độ tin cậy agent).</w:t>
+        <w:t>Ghi chú khi chuyển vào báo cáo chính thức: (1) đánh số lại hình/bảng theo template của khoa (bản DOCX sinh tự động đã nhúng đủ hình); (2) khi rà Chương 2 lần cuối, thêm trích dẫn chéo tại 4.6 (GPTDroid [2], VETL [3], VisionDroid/Trident [4], ITeM [13] cho luận điểm "test theo ý định", NaviQAte [10] cho mức trần độ tin cậy agent).</w:t>
       </w:r>
     </w:p>
     <w:p>

</xml_diff>